<commit_message>
day 20 home tasks
</commit_message>
<xml_diff>
--- a/DaywiseDocs/10096255_Day20.docx
+++ b/DaywiseDocs/10096255_Day20.docx
@@ -63,7 +63,7 @@
     <w:p>
       <w:r>
         <w:pict w14:anchorId="5FA9BC2C">
-          <v:rect id="_x0000_i1037" style="width:0;height:1.5pt" o:hralign="center" o:hrstd="t" o:hr="t" fillcolor="#a0a0a0" stroked="f"/>
+          <v:rect id="_x0000_i1025" style="width:0;height:1.5pt" o:hralign="center" o:hrstd="t" o:hr="t" fillcolor="#a0a0a0" stroked="f"/>
         </w:pict>
       </w:r>
     </w:p>
@@ -153,7 +153,7 @@
     <w:p>
       <w:r>
         <w:pict w14:anchorId="0DA4D401">
-          <v:rect id="_x0000_i1038" style="width:0;height:1.5pt" o:hralign="center" o:hrstd="t" o:hr="t" fillcolor="#a0a0a0" stroked="f"/>
+          <v:rect id="_x0000_i1026" style="width:0;height:1.5pt" o:hralign="center" o:hrstd="t" o:hr="t" fillcolor="#a0a0a0" stroked="f"/>
         </w:pict>
       </w:r>
     </w:p>
@@ -392,7 +392,7 @@
     <w:p>
       <w:r>
         <w:pict w14:anchorId="155694EB">
-          <v:rect id="_x0000_i1053" style="width:0;height:1.5pt" o:hralign="center" o:hrstd="t" o:hr="t" fillcolor="#a0a0a0" stroked="f"/>
+          <v:rect id="_x0000_i1027" style="width:0;height:1.5pt" o:hralign="center" o:hrstd="t" o:hr="t" fillcolor="#a0a0a0" stroked="f"/>
         </w:pict>
       </w:r>
     </w:p>
@@ -528,7 +528,7 @@
     <w:p>
       <w:r>
         <w:pict w14:anchorId="359BC866">
-          <v:rect id="_x0000_i1054" style="width:0;height:1.5pt" o:hralign="center" o:hrstd="t" o:hr="t" fillcolor="#a0a0a0" stroked="f"/>
+          <v:rect id="_x0000_i1028" style="width:0;height:1.5pt" o:hralign="center" o:hrstd="t" o:hr="t" fillcolor="#a0a0a0" stroked="f"/>
         </w:pict>
       </w:r>
     </w:p>
@@ -940,7 +940,7 @@
       <w:r>
         <w:lastRenderedPageBreak/>
         <w:pict w14:anchorId="38136593">
-          <v:rect id="_x0000_i1063" style="width:0;height:1.5pt" o:hralign="center" o:hrstd="t" o:hr="t" fillcolor="#a0a0a0" stroked="f"/>
+          <v:rect id="_x0000_i1029" style="width:0;height:1.5pt" o:hralign="center" o:hrstd="t" o:hr="t" fillcolor="#a0a0a0" stroked="f"/>
         </w:pict>
       </w:r>
     </w:p>
@@ -1394,6 +1394,1608 @@
     <w:p>
       <w:r>
         <w:t>import fs from 'fs'; // ES Module</w:t>
+      </w:r>
+    </w:p>
+    <w:p/>
+    <w:p/>
+    <w:p/>
+    <w:p/>
+    <w:p/>
+    <w:p/>
+    <w:p/>
+    <w:p/>
+    <w:p/>
+    <w:p/>
+    <w:p/>
+    <w:p/>
+    <w:p/>
+    <w:p/>
+    <w:p/>
+    <w:p/>
+    <w:p>
+      <w:pPr>
+        <w:rPr>
+          <w:b/>
+          <w:bCs/>
+        </w:rPr>
+      </w:pPr>
+      <w:r>
+        <w:rPr>
+          <w:b/>
+          <w:bCs/>
+        </w:rPr>
+        <w:lastRenderedPageBreak/>
+        <w:t xml:space="preserve">Node.js – Home Task </w:t>
+      </w:r>
+    </w:p>
+    <w:p>
+      <w:pPr>
+        <w:rPr>
+          <w:b/>
+          <w:bCs/>
+        </w:rPr>
+      </w:pPr>
+      <w:r>
+        <w:rPr>
+          <w:b/>
+          <w:bCs/>
+        </w:rPr>
+        <w:t>1. What is the difference between Node.js and a traditional web server like Apache or Nginx?</w:t>
+      </w:r>
+    </w:p>
+    <w:p>
+      <w:pPr>
+        <w:numPr>
+          <w:ilvl w:val="0"/>
+          <w:numId w:val="6"/>
+        </w:numPr>
+      </w:pPr>
+      <w:r>
+        <w:rPr>
+          <w:b/>
+          <w:bCs/>
+        </w:rPr>
+        <w:t>Node.js</w:t>
+      </w:r>
+      <w:r>
+        <w:t xml:space="preserve"> is a JavaScript runtime used to build server-side applications. </w:t>
+      </w:r>
+    </w:p>
+    <w:p>
+      <w:pPr>
+        <w:numPr>
+          <w:ilvl w:val="0"/>
+          <w:numId w:val="6"/>
+        </w:numPr>
+      </w:pPr>
+      <w:r>
+        <w:rPr>
+          <w:b/>
+          <w:bCs/>
+        </w:rPr>
+        <w:t>Apache/Nginx</w:t>
+      </w:r>
+      <w:r>
+        <w:t xml:space="preserve"> are traditional web servers mainly used to serve websites and handle HTTP requests. </w:t>
+      </w:r>
+    </w:p>
+    <w:p>
+      <w:pPr>
+        <w:numPr>
+          <w:ilvl w:val="0"/>
+          <w:numId w:val="6"/>
+        </w:numPr>
+      </w:pPr>
+      <w:r>
+        <w:t xml:space="preserve">Node.js uses </w:t>
+      </w:r>
+      <w:r>
+        <w:rPr>
+          <w:b/>
+          <w:bCs/>
+        </w:rPr>
+        <w:t>event-driven and non-blocking I/O</w:t>
+      </w:r>
+      <w:r>
+        <w:t xml:space="preserve">, making it good for real-time and I/O-heavy applications. </w:t>
+      </w:r>
+    </w:p>
+    <w:p>
+      <w:r>
+        <w:pict w14:anchorId="7243E069">
+          <v:rect id="_x0000_i1096" style="width:0;height:1.5pt" o:hralign="center" o:hrstd="t" o:hr="t" fillcolor="#a0a0a0" stroked="f"/>
+        </w:pict>
+      </w:r>
+    </w:p>
+    <w:p>
+      <w:pPr>
+        <w:rPr>
+          <w:b/>
+          <w:bCs/>
+        </w:rPr>
+      </w:pPr>
+      <w:r>
+        <w:rPr>
+          <w:b/>
+          <w:bCs/>
+        </w:rPr>
+        <w:t>2. Explain the event-driven architecture of Node.js.</w:t>
+      </w:r>
+    </w:p>
+    <w:p>
+      <w:pPr>
+        <w:numPr>
+          <w:ilvl w:val="0"/>
+          <w:numId w:val="7"/>
+        </w:numPr>
+      </w:pPr>
+      <w:r>
+        <w:t xml:space="preserve">Node.js works based on </w:t>
+      </w:r>
+      <w:r>
+        <w:rPr>
+          <w:b/>
+          <w:bCs/>
+        </w:rPr>
+        <w:t>events</w:t>
+      </w:r>
+      <w:r>
+        <w:t xml:space="preserve">. </w:t>
+      </w:r>
+    </w:p>
+    <w:p>
+      <w:pPr>
+        <w:numPr>
+          <w:ilvl w:val="0"/>
+          <w:numId w:val="7"/>
+        </w:numPr>
+      </w:pPr>
+      <w:r>
+        <w:t xml:space="preserve">When an operation is completed, an event is triggered. </w:t>
+      </w:r>
+    </w:p>
+    <w:p>
+      <w:pPr>
+        <w:numPr>
+          <w:ilvl w:val="0"/>
+          <w:numId w:val="7"/>
+        </w:numPr>
+      </w:pPr>
+      <w:r>
+        <w:t xml:space="preserve">Node.js then executes the related </w:t>
+      </w:r>
+      <w:r>
+        <w:rPr>
+          <w:b/>
+          <w:bCs/>
+        </w:rPr>
+        <w:t>callback/function</w:t>
+      </w:r>
+      <w:r>
+        <w:t xml:space="preserve">. </w:t>
+      </w:r>
+    </w:p>
+    <w:p>
+      <w:pPr>
+        <w:numPr>
+          <w:ilvl w:val="0"/>
+          <w:numId w:val="7"/>
+        </w:numPr>
+      </w:pPr>
+      <w:r>
+        <w:t xml:space="preserve">This allows Node.js to handle many requests without waiting for each one. </w:t>
+      </w:r>
+    </w:p>
+    <w:p>
+      <w:r>
+        <w:rPr>
+          <w:b/>
+          <w:bCs/>
+        </w:rPr>
+        <w:t>Example:</w:t>
+      </w:r>
+      <w:r>
+        <w:br/>
+        <w:t>A file is being read → Node.js continues other work → when reading finishes, the callback runs.</w:t>
+      </w:r>
+    </w:p>
+    <w:p>
+      <w:r>
+        <w:pict w14:anchorId="310523FE">
+          <v:rect id="_x0000_i1097" style="width:0;height:1.5pt" o:hralign="center" o:hrstd="t" o:hr="t" fillcolor="#a0a0a0" stroked="f"/>
+        </w:pict>
+      </w:r>
+    </w:p>
+    <w:p>
+      <w:pPr>
+        <w:rPr>
+          <w:b/>
+          <w:bCs/>
+        </w:rPr>
+      </w:pPr>
+      <w:r>
+        <w:rPr>
+          <w:b/>
+          <w:bCs/>
+        </w:rPr>
+        <w:t>3. How does the single-threaded model in Node.js handle concurrency?</w:t>
+      </w:r>
+    </w:p>
+    <w:p>
+      <w:pPr>
+        <w:numPr>
+          <w:ilvl w:val="0"/>
+          <w:numId w:val="8"/>
+        </w:numPr>
+      </w:pPr>
+      <w:r>
+        <w:t xml:space="preserve">Node.js mainly uses </w:t>
+      </w:r>
+      <w:r>
+        <w:rPr>
+          <w:b/>
+          <w:bCs/>
+        </w:rPr>
+        <w:t>one thread</w:t>
+      </w:r>
+      <w:r>
+        <w:t xml:space="preserve"> to execute JavaScript. </w:t>
+      </w:r>
+    </w:p>
+    <w:p>
+      <w:pPr>
+        <w:numPr>
+          <w:ilvl w:val="0"/>
+          <w:numId w:val="8"/>
+        </w:numPr>
+      </w:pPr>
+      <w:r>
+        <w:t xml:space="preserve">It does not create a new thread for every request. </w:t>
+      </w:r>
+    </w:p>
+    <w:p>
+      <w:pPr>
+        <w:numPr>
+          <w:ilvl w:val="0"/>
+          <w:numId w:val="8"/>
+        </w:numPr>
+      </w:pPr>
+      <w:r>
+        <w:t xml:space="preserve">It uses the </w:t>
+      </w:r>
+      <w:r>
+        <w:rPr>
+          <w:b/>
+          <w:bCs/>
+        </w:rPr>
+        <w:t>event loop</w:t>
+      </w:r>
+      <w:r>
+        <w:t xml:space="preserve"> and asynchronous operations to handle multiple tasks. </w:t>
+      </w:r>
+    </w:p>
+    <w:p>
+      <w:pPr>
+        <w:numPr>
+          <w:ilvl w:val="0"/>
+          <w:numId w:val="8"/>
+        </w:numPr>
+      </w:pPr>
+      <w:r>
+        <w:t xml:space="preserve">This makes Node.js lightweight and efficient for I/O operations. </w:t>
+      </w:r>
+    </w:p>
+    <w:p>
+      <w:r>
+        <w:pict w14:anchorId="2D4286E4">
+          <v:rect id="_x0000_i1098" style="width:0;height:1.5pt" o:hralign="center" o:hrstd="t" o:hr="t" fillcolor="#a0a0a0" stroked="f"/>
+        </w:pict>
+      </w:r>
+    </w:p>
+    <w:p>
+      <w:pPr>
+        <w:rPr>
+          <w:b/>
+          <w:bCs/>
+        </w:rPr>
+      </w:pPr>
+      <w:r>
+        <w:rPr>
+          <w:b/>
+          <w:bCs/>
+        </w:rPr>
+        <w:t>4. What is the role of the V8 engine in Node.js?</w:t>
+      </w:r>
+    </w:p>
+    <w:p>
+      <w:pPr>
+        <w:numPr>
+          <w:ilvl w:val="0"/>
+          <w:numId w:val="9"/>
+        </w:numPr>
+      </w:pPr>
+      <w:r>
+        <w:rPr>
+          <w:b/>
+          <w:bCs/>
+        </w:rPr>
+        <w:t>V8</w:t>
+      </w:r>
+      <w:r>
+        <w:t xml:space="preserve"> is Google's JavaScript engine. </w:t>
+      </w:r>
+    </w:p>
+    <w:p>
+      <w:pPr>
+        <w:numPr>
+          <w:ilvl w:val="0"/>
+          <w:numId w:val="9"/>
+        </w:numPr>
+      </w:pPr>
+      <w:r>
+        <w:t xml:space="preserve">Node.js uses V8 to </w:t>
+      </w:r>
+      <w:r>
+        <w:rPr>
+          <w:b/>
+          <w:bCs/>
+        </w:rPr>
+        <w:t>execute JavaScript code</w:t>
+      </w:r>
+      <w:r>
+        <w:t xml:space="preserve">. </w:t>
+      </w:r>
+    </w:p>
+    <w:p>
+      <w:pPr>
+        <w:numPr>
+          <w:ilvl w:val="0"/>
+          <w:numId w:val="9"/>
+        </w:numPr>
+      </w:pPr>
+      <w:r>
+        <w:t xml:space="preserve">It converts JavaScript into </w:t>
+      </w:r>
+      <w:r>
+        <w:rPr>
+          <w:b/>
+          <w:bCs/>
+        </w:rPr>
+        <w:t>machine code</w:t>
+      </w:r>
+      <w:r>
+        <w:t xml:space="preserve">, making execution fast. </w:t>
+      </w:r>
+    </w:p>
+    <w:p>
+      <w:pPr>
+        <w:numPr>
+          <w:ilvl w:val="0"/>
+          <w:numId w:val="9"/>
+        </w:numPr>
+      </w:pPr>
+      <w:r>
+        <w:t xml:space="preserve">V8 is also used by the </w:t>
+      </w:r>
+      <w:r>
+        <w:rPr>
+          <w:b/>
+          <w:bCs/>
+        </w:rPr>
+        <w:t>Google Chrome</w:t>
+      </w:r>
+      <w:r>
+        <w:t xml:space="preserve"> browser. </w:t>
+      </w:r>
+    </w:p>
+    <w:p>
+      <w:r>
+        <w:lastRenderedPageBreak/>
+        <w:pict w14:anchorId="6C3D9478">
+          <v:rect id="_x0000_i1099" style="width:0;height:1.5pt" o:hralign="center" o:hrstd="t" o:hr="t" fillcolor="#a0a0a0" stroked="f"/>
+        </w:pict>
+      </w:r>
+    </w:p>
+    <w:p>
+      <w:pPr>
+        <w:rPr>
+          <w:b/>
+          <w:bCs/>
+        </w:rPr>
+      </w:pPr>
+      <w:r>
+        <w:rPr>
+          <w:b/>
+          <w:bCs/>
+        </w:rPr>
+        <w:t>5. Why is Node.js considered non-blocking?</w:t>
+      </w:r>
+    </w:p>
+    <w:p>
+      <w:pPr>
+        <w:numPr>
+          <w:ilvl w:val="0"/>
+          <w:numId w:val="10"/>
+        </w:numPr>
+      </w:pPr>
+      <w:r>
+        <w:t xml:space="preserve">Node.js does not wait for slow operations like </w:t>
+      </w:r>
+      <w:r>
+        <w:rPr>
+          <w:b/>
+          <w:bCs/>
+        </w:rPr>
+        <w:t>file reading, database queries, or network requests</w:t>
+      </w:r>
+      <w:r>
+        <w:t xml:space="preserve">. </w:t>
+      </w:r>
+    </w:p>
+    <w:p>
+      <w:pPr>
+        <w:numPr>
+          <w:ilvl w:val="0"/>
+          <w:numId w:val="10"/>
+        </w:numPr>
+      </w:pPr>
+      <w:r>
+        <w:t xml:space="preserve">It starts the operation and continues doing other work. </w:t>
+      </w:r>
+    </w:p>
+    <w:p>
+      <w:pPr>
+        <w:numPr>
+          <w:ilvl w:val="0"/>
+          <w:numId w:val="10"/>
+        </w:numPr>
+      </w:pPr>
+      <w:r>
+        <w:t xml:space="preserve">When the operation finishes, Node.js processes the result. </w:t>
+      </w:r>
+    </w:p>
+    <w:p>
+      <w:r>
+        <w:rPr>
+          <w:b/>
+          <w:bCs/>
+        </w:rPr>
+        <w:t>Simple idea:</w:t>
+      </w:r>
+      <w:r>
+        <w:br/>
+        <w:t>Start I/O → Continue other work → Get result later</w:t>
+      </w:r>
+    </w:p>
+    <w:p>
+      <w:r>
+        <w:pict w14:anchorId="1175AFEA">
+          <v:rect id="_x0000_i1100" style="width:0;height:1.5pt" o:hralign="center" o:hrstd="t" o:hr="t" fillcolor="#a0a0a0" stroked="f"/>
+        </w:pict>
+      </w:r>
+    </w:p>
+    <w:p>
+      <w:pPr>
+        <w:rPr>
+          <w:b/>
+          <w:bCs/>
+        </w:rPr>
+      </w:pPr>
+      <w:r>
+        <w:rPr>
+          <w:b/>
+          <w:bCs/>
+        </w:rPr>
+        <w:t>6. What is the difference between callbacks, promises, and async/await?</w:t>
+      </w:r>
+    </w:p>
+    <w:tbl>
+      <w:tblPr>
+        <w:tblW w:w="0" w:type="auto"/>
+        <w:tblCellSpacing w:w="15" w:type="dxa"/>
+        <w:tblCellMar>
+          <w:top w:w="15" w:type="dxa"/>
+          <w:left w:w="15" w:type="dxa"/>
+          <w:bottom w:w="15" w:type="dxa"/>
+          <w:right w:w="15" w:type="dxa"/>
+        </w:tblCellMar>
+        <w:tblLook w:val="04A0" w:firstRow="1" w:lastRow="0" w:firstColumn="1" w:lastColumn="0" w:noHBand="0" w:noVBand="1"/>
+      </w:tblPr>
+      <w:tblGrid>
+        <w:gridCol w:w="1387"/>
+        <w:gridCol w:w="5336"/>
+      </w:tblGrid>
+      <w:tr>
+        <w:trPr>
+          <w:tblHeader/>
+          <w:tblCellSpacing w:w="15" w:type="dxa"/>
+        </w:trPr>
+        <w:tc>
+          <w:tcPr>
+            <w:tcW w:w="0" w:type="auto"/>
+            <w:vAlign w:val="center"/>
+            <w:hideMark/>
+          </w:tcPr>
+          <w:p>
+            <w:pPr>
+              <w:rPr>
+                <w:b/>
+                <w:bCs/>
+              </w:rPr>
+            </w:pPr>
+            <w:r>
+              <w:rPr>
+                <w:b/>
+                <w:bCs/>
+              </w:rPr>
+              <w:t>Method</w:t>
+            </w:r>
+          </w:p>
+        </w:tc>
+        <w:tc>
+          <w:tcPr>
+            <w:tcW w:w="0" w:type="auto"/>
+            <w:vAlign w:val="center"/>
+            <w:hideMark/>
+          </w:tcPr>
+          <w:p>
+            <w:pPr>
+              <w:rPr>
+                <w:b/>
+                <w:bCs/>
+              </w:rPr>
+            </w:pPr>
+            <w:r>
+              <w:rPr>
+                <w:b/>
+                <w:bCs/>
+              </w:rPr>
+              <w:t>Simple Meaning</w:t>
+            </w:r>
+          </w:p>
+        </w:tc>
+      </w:tr>
+      <w:tr>
+        <w:trPr>
+          <w:tblCellSpacing w:w="15" w:type="dxa"/>
+        </w:trPr>
+        <w:tc>
+          <w:tcPr>
+            <w:tcW w:w="0" w:type="auto"/>
+            <w:vAlign w:val="center"/>
+            <w:hideMark/>
+          </w:tcPr>
+          <w:p>
+            <w:r>
+              <w:rPr>
+                <w:b/>
+                <w:bCs/>
+              </w:rPr>
+              <w:t>Callback</w:t>
+            </w:r>
+          </w:p>
+        </w:tc>
+        <w:tc>
+          <w:tcPr>
+            <w:tcW w:w="0" w:type="auto"/>
+            <w:vAlign w:val="center"/>
+            <w:hideMark/>
+          </w:tcPr>
+          <w:p>
+            <w:r>
+              <w:t>Function executed after an operation finishes</w:t>
+            </w:r>
+          </w:p>
+        </w:tc>
+      </w:tr>
+      <w:tr>
+        <w:trPr>
+          <w:tblCellSpacing w:w="15" w:type="dxa"/>
+        </w:trPr>
+        <w:tc>
+          <w:tcPr>
+            <w:tcW w:w="0" w:type="auto"/>
+            <w:vAlign w:val="center"/>
+            <w:hideMark/>
+          </w:tcPr>
+          <w:p>
+            <w:r>
+              <w:rPr>
+                <w:b/>
+                <w:bCs/>
+              </w:rPr>
+              <w:t>Promise</w:t>
+            </w:r>
+          </w:p>
+        </w:tc>
+        <w:tc>
+          <w:tcPr>
+            <w:tcW w:w="0" w:type="auto"/>
+            <w:vAlign w:val="center"/>
+            <w:hideMark/>
+          </w:tcPr>
+          <w:p>
+            <w:r>
+              <w:t>Represents a future result using .then() and .catch()</w:t>
+            </w:r>
+          </w:p>
+        </w:tc>
+      </w:tr>
+      <w:tr>
+        <w:trPr>
+          <w:tblCellSpacing w:w="15" w:type="dxa"/>
+        </w:trPr>
+        <w:tc>
+          <w:tcPr>
+            <w:tcW w:w="0" w:type="auto"/>
+            <w:vAlign w:val="center"/>
+            <w:hideMark/>
+          </w:tcPr>
+          <w:p>
+            <w:r>
+              <w:rPr>
+                <w:b/>
+                <w:bCs/>
+              </w:rPr>
+              <w:t>async/await</w:t>
+            </w:r>
+          </w:p>
+        </w:tc>
+        <w:tc>
+          <w:tcPr>
+            <w:tcW w:w="0" w:type="auto"/>
+            <w:vAlign w:val="center"/>
+            <w:hideMark/>
+          </w:tcPr>
+          <w:p>
+            <w:r>
+              <w:t>Cleaner way to write and handle promises</w:t>
+            </w:r>
+          </w:p>
+        </w:tc>
+      </w:tr>
+    </w:tbl>
+    <w:p>
+      <w:r>
+        <w:rPr>
+          <w:b/>
+          <w:bCs/>
+        </w:rPr>
+        <w:t>In short:</w:t>
+      </w:r>
+      <w:r>
+        <w:br/>
+        <w:t>Callbacks → older approach</w:t>
+      </w:r>
+      <w:r>
+        <w:br/>
+        <w:t>Promises → better handling</w:t>
+      </w:r>
+      <w:r>
+        <w:br/>
+        <w:t>Async/await → easiest to read</w:t>
+      </w:r>
+    </w:p>
+    <w:p>
+      <w:r>
+        <w:pict w14:anchorId="6AEA6245">
+          <v:rect id="_x0000_i1101" style="width:0;height:1.5pt" o:hralign="center" o:hrstd="t" o:hr="t" fillcolor="#a0a0a0" stroked="f"/>
+        </w:pict>
+      </w:r>
+    </w:p>
+    <w:p>
+      <w:pPr>
+        <w:rPr>
+          <w:b/>
+          <w:bCs/>
+        </w:rPr>
+      </w:pPr>
+      <w:r>
+        <w:rPr>
+          <w:b/>
+          <w:bCs/>
+        </w:rPr>
+        <w:t>7. How does the event loop work, and what are its phases?</w:t>
+      </w:r>
+    </w:p>
+    <w:p>
+      <w:pPr>
+        <w:numPr>
+          <w:ilvl w:val="0"/>
+          <w:numId w:val="11"/>
+        </w:numPr>
+      </w:pPr>
+      <w:r>
+        <w:t xml:space="preserve">The </w:t>
+      </w:r>
+      <w:r>
+        <w:rPr>
+          <w:b/>
+          <w:bCs/>
+        </w:rPr>
+        <w:t>event loop</w:t>
+      </w:r>
+      <w:r>
+        <w:t xml:space="preserve"> continuously checks for completed asynchronous operations. </w:t>
+      </w:r>
+    </w:p>
+    <w:p>
+      <w:pPr>
+        <w:numPr>
+          <w:ilvl w:val="0"/>
+          <w:numId w:val="11"/>
+        </w:numPr>
+      </w:pPr>
+      <w:r>
+        <w:t xml:space="preserve">It takes their callbacks and executes them when appropriate. </w:t>
+      </w:r>
+    </w:p>
+    <w:p>
+      <w:pPr>
+        <w:numPr>
+          <w:ilvl w:val="0"/>
+          <w:numId w:val="11"/>
+        </w:numPr>
+      </w:pPr>
+      <w:r>
+        <w:t xml:space="preserve">Important phases include: </w:t>
+      </w:r>
+    </w:p>
+    <w:p>
+      <w:pPr>
+        <w:numPr>
+          <w:ilvl w:val="1"/>
+          <w:numId w:val="11"/>
+        </w:numPr>
+      </w:pPr>
+      <w:r>
+        <w:rPr>
+          <w:b/>
+          <w:bCs/>
+        </w:rPr>
+        <w:t>Timers</w:t>
+      </w:r>
+      <w:r>
+        <w:t xml:space="preserve"> – </w:t>
+      </w:r>
+      <w:proofErr w:type="spellStart"/>
+      <w:r>
+        <w:t>setTimeout</w:t>
+      </w:r>
+      <w:proofErr w:type="spellEnd"/>
+      <w:r>
+        <w:t xml:space="preserve">(), </w:t>
+      </w:r>
+      <w:proofErr w:type="spellStart"/>
+      <w:r>
+        <w:t>setInterval</w:t>
+      </w:r>
+      <w:proofErr w:type="spellEnd"/>
+      <w:r>
+        <w:t xml:space="preserve">() </w:t>
+      </w:r>
+    </w:p>
+    <w:p>
+      <w:pPr>
+        <w:numPr>
+          <w:ilvl w:val="1"/>
+          <w:numId w:val="11"/>
+        </w:numPr>
+      </w:pPr>
+      <w:r>
+        <w:rPr>
+          <w:b/>
+          <w:bCs/>
+        </w:rPr>
+        <w:t>Pending callbacks</w:t>
+      </w:r>
+      <w:r>
+        <w:t xml:space="preserve"> </w:t>
+      </w:r>
+    </w:p>
+    <w:p>
+      <w:pPr>
+        <w:numPr>
+          <w:ilvl w:val="1"/>
+          <w:numId w:val="11"/>
+        </w:numPr>
+      </w:pPr>
+      <w:r>
+        <w:rPr>
+          <w:b/>
+          <w:bCs/>
+        </w:rPr>
+        <w:t>Poll</w:t>
+      </w:r>
+      <w:r>
+        <w:t xml:space="preserve"> – handles I/O </w:t>
+      </w:r>
+    </w:p>
+    <w:p>
+      <w:pPr>
+        <w:numPr>
+          <w:ilvl w:val="1"/>
+          <w:numId w:val="11"/>
+        </w:numPr>
+      </w:pPr>
+      <w:r>
+        <w:rPr>
+          <w:b/>
+          <w:bCs/>
+        </w:rPr>
+        <w:t>Check</w:t>
+      </w:r>
+      <w:r>
+        <w:t xml:space="preserve"> – </w:t>
+      </w:r>
+      <w:proofErr w:type="spellStart"/>
+      <w:r>
+        <w:t>setImmediate</w:t>
+      </w:r>
+      <w:proofErr w:type="spellEnd"/>
+      <w:r>
+        <w:t xml:space="preserve">() </w:t>
+      </w:r>
+    </w:p>
+    <w:p>
+      <w:pPr>
+        <w:numPr>
+          <w:ilvl w:val="1"/>
+          <w:numId w:val="11"/>
+        </w:numPr>
+      </w:pPr>
+      <w:r>
+        <w:rPr>
+          <w:b/>
+          <w:bCs/>
+        </w:rPr>
+        <w:t>Close callbacks</w:t>
+      </w:r>
+      <w:r>
+        <w:t xml:space="preserve"> </w:t>
+      </w:r>
+    </w:p>
+    <w:p>
+      <w:r>
+        <w:rPr>
+          <w:b/>
+          <w:bCs/>
+        </w:rPr>
+        <w:t>Main purpose:</w:t>
+      </w:r>
+      <w:r>
+        <w:t xml:space="preserve"> Keep Node.js responsive while handling asynchronous tasks.</w:t>
+      </w:r>
+    </w:p>
+    <w:p>
+      <w:r>
+        <w:lastRenderedPageBreak/>
+        <w:pict w14:anchorId="3CC8EF19">
+          <v:rect id="_x0000_i1102" style="width:0;height:1.5pt" o:hralign="center" o:hrstd="t" o:hr="t" fillcolor="#a0a0a0" stroked="f"/>
+        </w:pict>
+      </w:r>
+    </w:p>
+    <w:p>
+      <w:pPr>
+        <w:rPr>
+          <w:b/>
+          <w:bCs/>
+        </w:rPr>
+      </w:pPr>
+      <w:r>
+        <w:rPr>
+          <w:b/>
+          <w:bCs/>
+        </w:rPr>
+        <w:t xml:space="preserve">8. What is the difference between </w:t>
+      </w:r>
+      <w:proofErr w:type="spellStart"/>
+      <w:r>
+        <w:rPr>
+          <w:b/>
+          <w:bCs/>
+        </w:rPr>
+        <w:t>process.nextTick</w:t>
+      </w:r>
+      <w:proofErr w:type="spellEnd"/>
+      <w:r>
+        <w:rPr>
+          <w:b/>
+          <w:bCs/>
+        </w:rPr>
+        <w:t xml:space="preserve">() and </w:t>
+      </w:r>
+      <w:proofErr w:type="spellStart"/>
+      <w:r>
+        <w:rPr>
+          <w:b/>
+          <w:bCs/>
+        </w:rPr>
+        <w:t>setImmediate</w:t>
+      </w:r>
+      <w:proofErr w:type="spellEnd"/>
+      <w:r>
+        <w:rPr>
+          <w:b/>
+          <w:bCs/>
+        </w:rPr>
+        <w:t>()?</w:t>
+      </w:r>
+    </w:p>
+    <w:p>
+      <w:pPr>
+        <w:numPr>
+          <w:ilvl w:val="0"/>
+          <w:numId w:val="12"/>
+        </w:numPr>
+      </w:pPr>
+      <w:proofErr w:type="spellStart"/>
+      <w:r>
+        <w:t>process.nextTick</w:t>
+      </w:r>
+      <w:proofErr w:type="spellEnd"/>
+      <w:r>
+        <w:t xml:space="preserve">() executes </w:t>
+      </w:r>
+      <w:r>
+        <w:rPr>
+          <w:b/>
+          <w:bCs/>
+        </w:rPr>
+        <w:t>very soon after the current operation</w:t>
+      </w:r>
+      <w:r>
+        <w:t xml:space="preserve">, before the event loop continues. </w:t>
+      </w:r>
+    </w:p>
+    <w:p>
+      <w:pPr>
+        <w:numPr>
+          <w:ilvl w:val="0"/>
+          <w:numId w:val="12"/>
+        </w:numPr>
+      </w:pPr>
+      <w:proofErr w:type="spellStart"/>
+      <w:r>
+        <w:t>setImmediate</w:t>
+      </w:r>
+      <w:proofErr w:type="spellEnd"/>
+      <w:r>
+        <w:t xml:space="preserve">() executes during the </w:t>
+      </w:r>
+      <w:r>
+        <w:rPr>
+          <w:b/>
+          <w:bCs/>
+        </w:rPr>
+        <w:t>check phase</w:t>
+      </w:r>
+      <w:r>
+        <w:t xml:space="preserve"> of the event loop. </w:t>
+      </w:r>
+    </w:p>
+    <w:p>
+      <w:pPr>
+        <w:numPr>
+          <w:ilvl w:val="0"/>
+          <w:numId w:val="12"/>
+        </w:numPr>
+      </w:pPr>
+      <w:r>
+        <w:t xml:space="preserve">Generally, </w:t>
+      </w:r>
+      <w:proofErr w:type="spellStart"/>
+      <w:r>
+        <w:t>process.nextTick</w:t>
+      </w:r>
+      <w:proofErr w:type="spellEnd"/>
+      <w:r>
+        <w:t xml:space="preserve">() runs before </w:t>
+      </w:r>
+      <w:proofErr w:type="spellStart"/>
+      <w:r>
+        <w:t>setImmediate</w:t>
+      </w:r>
+      <w:proofErr w:type="spellEnd"/>
+      <w:r>
+        <w:t xml:space="preserve">(). </w:t>
+      </w:r>
+    </w:p>
+    <w:p>
+      <w:r>
+        <w:rPr>
+          <w:b/>
+          <w:bCs/>
+        </w:rPr>
+        <w:t>Simple:</w:t>
+      </w:r>
+      <w:r>
+        <w:br/>
+      </w:r>
+      <w:proofErr w:type="spellStart"/>
+      <w:r>
+        <w:t>process.nextTick</w:t>
+      </w:r>
+      <w:proofErr w:type="spellEnd"/>
+      <w:r>
+        <w:t>() → higher priority</w:t>
+      </w:r>
+      <w:r>
+        <w:br/>
+      </w:r>
+      <w:proofErr w:type="spellStart"/>
+      <w:r>
+        <w:t>setImmediate</w:t>
+      </w:r>
+      <w:proofErr w:type="spellEnd"/>
+      <w:r>
+        <w:t>() → check phase</w:t>
+      </w:r>
+    </w:p>
+    <w:p>
+      <w:r>
+        <w:pict w14:anchorId="038959A4">
+          <v:rect id="_x0000_i1103" style="width:0;height:1.5pt" o:hralign="center" o:hrstd="t" o:hr="t" fillcolor="#a0a0a0" stroked="f"/>
+        </w:pict>
+      </w:r>
+    </w:p>
+    <w:p>
+      <w:pPr>
+        <w:rPr>
+          <w:b/>
+          <w:bCs/>
+        </w:rPr>
+      </w:pPr>
+      <w:r>
+        <w:rPr>
+          <w:b/>
+          <w:bCs/>
+        </w:rPr>
+        <w:t>9. How does Node.js handle I/O operations asynchronously?</w:t>
+      </w:r>
+    </w:p>
+    <w:p>
+      <w:pPr>
+        <w:numPr>
+          <w:ilvl w:val="0"/>
+          <w:numId w:val="13"/>
+        </w:numPr>
+      </w:pPr>
+      <w:r>
+        <w:t xml:space="preserve">Node.js uses </w:t>
+      </w:r>
+      <w:proofErr w:type="spellStart"/>
+      <w:r>
+        <w:rPr>
+          <w:b/>
+          <w:bCs/>
+        </w:rPr>
+        <w:t>libuv</w:t>
+      </w:r>
+      <w:proofErr w:type="spellEnd"/>
+      <w:r>
+        <w:t xml:space="preserve"> to manage asynchronous I/O. </w:t>
+      </w:r>
+    </w:p>
+    <w:p>
+      <w:pPr>
+        <w:numPr>
+          <w:ilvl w:val="0"/>
+          <w:numId w:val="13"/>
+        </w:numPr>
+      </w:pPr>
+      <w:r>
+        <w:t xml:space="preserve">I/O operations are handled by the operating system or background mechanisms. </w:t>
+      </w:r>
+    </w:p>
+    <w:p>
+      <w:pPr>
+        <w:numPr>
+          <w:ilvl w:val="0"/>
+          <w:numId w:val="13"/>
+        </w:numPr>
+      </w:pPr>
+      <w:r>
+        <w:t xml:space="preserve">The main JavaScript thread does not wait for them. </w:t>
+      </w:r>
+    </w:p>
+    <w:p>
+      <w:pPr>
+        <w:numPr>
+          <w:ilvl w:val="0"/>
+          <w:numId w:val="13"/>
+        </w:numPr>
+      </w:pPr>
+      <w:r>
+        <w:t xml:space="preserve">When the operation finishes, its callback is placed in the appropriate queue. </w:t>
+      </w:r>
+    </w:p>
+    <w:p>
+      <w:r>
+        <w:rPr>
+          <w:b/>
+          <w:bCs/>
+        </w:rPr>
+        <w:t>Result:</w:t>
+      </w:r>
+      <w:r>
+        <w:t xml:space="preserve"> One Node.js process can handle many I/O requests efficiently.</w:t>
+      </w:r>
+    </w:p>
+    <w:p>
+      <w:r>
+        <w:pict w14:anchorId="4740ADF6">
+          <v:rect id="_x0000_i1104" style="width:0;height:1.5pt" o:hralign="center" o:hrstd="t" o:hr="t" fillcolor="#a0a0a0" stroked="f"/>
+        </w:pict>
+      </w:r>
+    </w:p>
+    <w:p>
+      <w:pPr>
+        <w:rPr>
+          <w:b/>
+          <w:bCs/>
+        </w:rPr>
+      </w:pPr>
+      <w:r>
+        <w:rPr>
+          <w:b/>
+          <w:bCs/>
+        </w:rPr>
+        <w:t>10. How does the require() function work internally?</w:t>
+      </w:r>
+    </w:p>
+    <w:p>
+      <w:r>
+        <w:t>When we write:</w:t>
+      </w:r>
+    </w:p>
+    <w:p>
+      <w:proofErr w:type="spellStart"/>
+      <w:r>
+        <w:t>const</w:t>
+      </w:r>
+      <w:proofErr w:type="spellEnd"/>
+      <w:r>
+        <w:t xml:space="preserve"> fs = require("fs");</w:t>
+      </w:r>
+    </w:p>
+    <w:p>
+      <w:r>
+        <w:t>Node.js:</w:t>
+      </w:r>
+    </w:p>
+    <w:p>
+      <w:pPr>
+        <w:numPr>
+          <w:ilvl w:val="0"/>
+          <w:numId w:val="14"/>
+        </w:numPr>
+      </w:pPr>
+      <w:r>
+        <w:t xml:space="preserve">Finds the required module. </w:t>
+      </w:r>
+    </w:p>
+    <w:p>
+      <w:pPr>
+        <w:numPr>
+          <w:ilvl w:val="0"/>
+          <w:numId w:val="14"/>
+        </w:numPr>
+      </w:pPr>
+      <w:r>
+        <w:t xml:space="preserve">Loads and executes it. </w:t>
+      </w:r>
+    </w:p>
+    <w:p>
+      <w:pPr>
+        <w:numPr>
+          <w:ilvl w:val="0"/>
+          <w:numId w:val="14"/>
+        </w:numPr>
+      </w:pPr>
+      <w:r>
+        <w:t xml:space="preserve">Returns its exported value. </w:t>
+      </w:r>
+    </w:p>
+    <w:p>
+      <w:pPr>
+        <w:numPr>
+          <w:ilvl w:val="0"/>
+          <w:numId w:val="14"/>
+        </w:numPr>
+      </w:pPr>
+      <w:r>
+        <w:rPr>
+          <w:b/>
+          <w:bCs/>
+        </w:rPr>
+        <w:t>Caches the module</w:t>
+      </w:r>
+      <w:r>
+        <w:t xml:space="preserve">, so repeated require() calls don't reload it unnecessarily. </w:t>
+      </w:r>
+    </w:p>
+    <w:p>
+      <w:r>
+        <w:pict w14:anchorId="175E97DA">
+          <v:rect id="_x0000_i1105" style="width:0;height:1.5pt" o:hralign="center" o:hrstd="t" o:hr="t" fillcolor="#a0a0a0" stroked="f"/>
+        </w:pict>
+      </w:r>
+    </w:p>
+    <w:p>
+      <w:pPr>
+        <w:rPr>
+          <w:b/>
+          <w:bCs/>
+        </w:rPr>
+      </w:pPr>
+      <w:r>
+        <w:rPr>
+          <w:b/>
+          <w:bCs/>
+        </w:rPr>
+        <w:t xml:space="preserve">11. What is the purpose of </w:t>
+      </w:r>
+      <w:proofErr w:type="spellStart"/>
+      <w:r>
+        <w:rPr>
+          <w:b/>
+          <w:bCs/>
+        </w:rPr>
+        <w:t>package.json</w:t>
+      </w:r>
+      <w:proofErr w:type="spellEnd"/>
+      <w:r>
+        <w:rPr>
+          <w:b/>
+          <w:bCs/>
+        </w:rPr>
+        <w:t xml:space="preserve"> and package-</w:t>
+      </w:r>
+      <w:proofErr w:type="spellStart"/>
+      <w:r>
+        <w:rPr>
+          <w:b/>
+          <w:bCs/>
+        </w:rPr>
+        <w:t>lock.json</w:t>
+      </w:r>
+      <w:proofErr w:type="spellEnd"/>
+      <w:r>
+        <w:rPr>
+          <w:b/>
+          <w:bCs/>
+        </w:rPr>
+        <w:t>?</w:t>
+      </w:r>
+    </w:p>
+    <w:p>
+      <w:proofErr w:type="spellStart"/>
+      <w:r>
+        <w:rPr>
+          <w:b/>
+          <w:bCs/>
+        </w:rPr>
+        <w:t>package.json</w:t>
+      </w:r>
+      <w:proofErr w:type="spellEnd"/>
+    </w:p>
+    <w:p>
+      <w:pPr>
+        <w:numPr>
+          <w:ilvl w:val="0"/>
+          <w:numId w:val="15"/>
+        </w:numPr>
+      </w:pPr>
+      <w:r>
+        <w:t xml:space="preserve">Contains project information. </w:t>
+      </w:r>
+    </w:p>
+    <w:p>
+      <w:pPr>
+        <w:numPr>
+          <w:ilvl w:val="0"/>
+          <w:numId w:val="15"/>
+        </w:numPr>
+      </w:pPr>
+      <w:r>
+        <w:lastRenderedPageBreak/>
+        <w:t xml:space="preserve">Defines dependencies. </w:t>
+      </w:r>
+    </w:p>
+    <w:p>
+      <w:pPr>
+        <w:numPr>
+          <w:ilvl w:val="0"/>
+          <w:numId w:val="15"/>
+        </w:numPr>
+      </w:pPr>
+      <w:r>
+        <w:t xml:space="preserve">Stores </w:t>
+      </w:r>
+      <w:proofErr w:type="spellStart"/>
+      <w:r>
+        <w:t>npm</w:t>
+      </w:r>
+      <w:proofErr w:type="spellEnd"/>
+      <w:r>
+        <w:t xml:space="preserve"> scripts. </w:t>
+      </w:r>
+    </w:p>
+    <w:p>
+      <w:pPr>
+        <w:numPr>
+          <w:ilvl w:val="0"/>
+          <w:numId w:val="15"/>
+        </w:numPr>
+      </w:pPr>
+      <w:r>
+        <w:t xml:space="preserve">Example: </w:t>
+      </w:r>
+      <w:proofErr w:type="spellStart"/>
+      <w:r>
+        <w:t>npm</w:t>
+      </w:r>
+      <w:proofErr w:type="spellEnd"/>
+      <w:r>
+        <w:t xml:space="preserve"> start </w:t>
+      </w:r>
+    </w:p>
+    <w:p>
+      <w:r>
+        <w:rPr>
+          <w:b/>
+          <w:bCs/>
+        </w:rPr>
+        <w:t>package-</w:t>
+      </w:r>
+      <w:proofErr w:type="spellStart"/>
+      <w:r>
+        <w:rPr>
+          <w:b/>
+          <w:bCs/>
+        </w:rPr>
+        <w:t>lock.json</w:t>
+      </w:r>
+      <w:proofErr w:type="spellEnd"/>
+    </w:p>
+    <w:p>
+      <w:pPr>
+        <w:numPr>
+          <w:ilvl w:val="0"/>
+          <w:numId w:val="16"/>
+        </w:numPr>
+      </w:pPr>
+      <w:r>
+        <w:t xml:space="preserve">Stores the </w:t>
+      </w:r>
+      <w:r>
+        <w:rPr>
+          <w:b/>
+          <w:bCs/>
+        </w:rPr>
+        <w:t>exact versions</w:t>
+      </w:r>
+      <w:r>
+        <w:t xml:space="preserve"> of installed packages. </w:t>
+      </w:r>
+    </w:p>
+    <w:p>
+      <w:pPr>
+        <w:numPr>
+          <w:ilvl w:val="0"/>
+          <w:numId w:val="16"/>
+        </w:numPr>
+      </w:pPr>
+      <w:r>
+        <w:t xml:space="preserve">Helps developers install the same dependency versions. </w:t>
+      </w:r>
+    </w:p>
+    <w:p>
+      <w:pPr>
+        <w:numPr>
+          <w:ilvl w:val="0"/>
+          <w:numId w:val="16"/>
+        </w:numPr>
+      </w:pPr>
+      <w:r>
+        <w:t xml:space="preserve">Makes builds more consistent. </w:t>
+      </w:r>
+    </w:p>
+    <w:p>
+      <w:r>
+        <w:pict w14:anchorId="22F445BD">
+          <v:rect id="_x0000_i1106" style="width:0;height:1.5pt" o:hralign="center" o:hrstd="t" o:hr="t" fillcolor="#a0a0a0" stroked="f"/>
+        </w:pict>
+      </w:r>
+    </w:p>
+    <w:p>
+      <w:pPr>
+        <w:rPr>
+          <w:b/>
+          <w:bCs/>
+        </w:rPr>
+      </w:pPr>
+      <w:r>
+        <w:rPr>
+          <w:b/>
+          <w:bCs/>
+        </w:rPr>
+        <w:t xml:space="preserve">12. Difference between dependencies and </w:t>
+      </w:r>
+      <w:proofErr w:type="spellStart"/>
+      <w:r>
+        <w:rPr>
+          <w:b/>
+          <w:bCs/>
+        </w:rPr>
+        <w:t>devDependencies</w:t>
+      </w:r>
+      <w:proofErr w:type="spellEnd"/>
+      <w:r>
+        <w:rPr>
+          <w:b/>
+          <w:bCs/>
+        </w:rPr>
+        <w:t xml:space="preserve"> in </w:t>
+      </w:r>
+      <w:proofErr w:type="spellStart"/>
+      <w:r>
+        <w:rPr>
+          <w:b/>
+          <w:bCs/>
+        </w:rPr>
+        <w:t>npm</w:t>
+      </w:r>
+      <w:proofErr w:type="spellEnd"/>
+    </w:p>
+    <w:p>
+      <w:r>
+        <w:rPr>
+          <w:b/>
+          <w:bCs/>
+        </w:rPr>
+        <w:t>dependencies</w:t>
+      </w:r>
+    </w:p>
+    <w:p>
+      <w:pPr>
+        <w:numPr>
+          <w:ilvl w:val="0"/>
+          <w:numId w:val="17"/>
+        </w:numPr>
+      </w:pPr>
+      <w:r>
+        <w:t xml:space="preserve">Required for the application to </w:t>
+      </w:r>
+      <w:r>
+        <w:rPr>
+          <w:b/>
+          <w:bCs/>
+        </w:rPr>
+        <w:t>run</w:t>
+      </w:r>
+      <w:r>
+        <w:t xml:space="preserve">. </w:t>
+      </w:r>
+    </w:p>
+    <w:p>
+      <w:pPr>
+        <w:numPr>
+          <w:ilvl w:val="0"/>
+          <w:numId w:val="17"/>
+        </w:numPr>
+      </w:pPr>
+      <w:r>
+        <w:t xml:space="preserve">Example: express </w:t>
+      </w:r>
+    </w:p>
+    <w:p>
+      <w:proofErr w:type="spellStart"/>
+      <w:r>
+        <w:t>npm</w:t>
+      </w:r>
+      <w:proofErr w:type="spellEnd"/>
+      <w:r>
+        <w:t xml:space="preserve"> install express</w:t>
+      </w:r>
+    </w:p>
+    <w:p>
+      <w:proofErr w:type="spellStart"/>
+      <w:r>
+        <w:rPr>
+          <w:b/>
+          <w:bCs/>
+        </w:rPr>
+        <w:t>devDependencies</w:t>
+      </w:r>
+      <w:proofErr w:type="spellEnd"/>
+    </w:p>
+    <w:p>
+      <w:pPr>
+        <w:numPr>
+          <w:ilvl w:val="0"/>
+          <w:numId w:val="18"/>
+        </w:numPr>
+      </w:pPr>
+      <w:r>
+        <w:t xml:space="preserve">Required mainly for </w:t>
+      </w:r>
+      <w:r>
+        <w:rPr>
+          <w:b/>
+          <w:bCs/>
+        </w:rPr>
+        <w:t>development, testing, or building</w:t>
+      </w:r>
+      <w:r>
+        <w:t xml:space="preserve">. </w:t>
+      </w:r>
+    </w:p>
+    <w:p>
+      <w:pPr>
+        <w:numPr>
+          <w:ilvl w:val="0"/>
+          <w:numId w:val="18"/>
+        </w:numPr>
+      </w:pPr>
+      <w:r>
+        <w:t xml:space="preserve">Example: jest, </w:t>
+      </w:r>
+      <w:proofErr w:type="spellStart"/>
+      <w:r>
+        <w:t>eslint</w:t>
+      </w:r>
+      <w:proofErr w:type="spellEnd"/>
+      <w:r>
+        <w:t xml:space="preserve"> </w:t>
+      </w:r>
+    </w:p>
+    <w:p>
+      <w:proofErr w:type="spellStart"/>
+      <w:r>
+        <w:t>npm</w:t>
+      </w:r>
+      <w:proofErr w:type="spellEnd"/>
+      <w:r>
+        <w:t xml:space="preserve"> install --save-dev jest</w:t>
+      </w:r>
+    </w:p>
+    <w:p>
+      <w:r>
+        <w:rPr>
+          <w:b/>
+          <w:bCs/>
+        </w:rPr>
+        <w:t>Easy way to remember:</w:t>
+      </w:r>
+    </w:p>
+    <w:p>
+      <w:r>
+        <w:rPr>
+          <w:b/>
+          <w:bCs/>
+        </w:rPr>
+        <w:t>dependencies = needed to run</w:t>
+      </w:r>
+      <w:r>
+        <w:br/>
+      </w:r>
+      <w:proofErr w:type="spellStart"/>
+      <w:r>
+        <w:rPr>
+          <w:b/>
+          <w:bCs/>
+        </w:rPr>
+        <w:t>devDependencies</w:t>
+      </w:r>
+      <w:proofErr w:type="spellEnd"/>
+      <w:r>
+        <w:rPr>
+          <w:b/>
+          <w:bCs/>
+        </w:rPr>
+        <w:t xml:space="preserve"> = needed to develop</w:t>
       </w:r>
     </w:p>
     <w:p/>
@@ -1523,6 +3125,453 @@
     </w:lvl>
   </w:abstractNum>
   <w:abstractNum w:abstractNumId="1" w15:restartNumberingAfterBreak="0">
+    <w:nsid w:val="10DF6F95"/>
+    <w:multiLevelType w:val="multilevel"/>
+    <w:tmpl w:val="F46C75D8"/>
+    <w:lvl w:ilvl="0">
+      <w:start w:val="1"/>
+      <w:numFmt w:val="bullet"/>
+      <w:lvlText w:val=""/>
+      <w:lvlJc w:val="left"/>
+      <w:pPr>
+        <w:tabs>
+          <w:tab w:val="num" w:pos="720"/>
+        </w:tabs>
+        <w:ind w:left="720" w:hanging="360"/>
+      </w:pPr>
+      <w:rPr>
+        <w:rFonts w:ascii="Symbol" w:hAnsi="Symbol" w:hint="default"/>
+        <w:sz w:val="20"/>
+      </w:rPr>
+    </w:lvl>
+    <w:lvl w:ilvl="1" w:tentative="1">
+      <w:start w:val="1"/>
+      <w:numFmt w:val="bullet"/>
+      <w:lvlText w:val="o"/>
+      <w:lvlJc w:val="left"/>
+      <w:pPr>
+        <w:tabs>
+          <w:tab w:val="num" w:pos="1440"/>
+        </w:tabs>
+        <w:ind w:left="1440" w:hanging="360"/>
+      </w:pPr>
+      <w:rPr>
+        <w:rFonts w:ascii="Courier New" w:hAnsi="Courier New" w:hint="default"/>
+        <w:sz w:val="20"/>
+      </w:rPr>
+    </w:lvl>
+    <w:lvl w:ilvl="2" w:tentative="1">
+      <w:start w:val="1"/>
+      <w:numFmt w:val="bullet"/>
+      <w:lvlText w:val=""/>
+      <w:lvlJc w:val="left"/>
+      <w:pPr>
+        <w:tabs>
+          <w:tab w:val="num" w:pos="2160"/>
+        </w:tabs>
+        <w:ind w:left="2160" w:hanging="360"/>
+      </w:pPr>
+      <w:rPr>
+        <w:rFonts w:ascii="Wingdings" w:hAnsi="Wingdings" w:hint="default"/>
+        <w:sz w:val="20"/>
+      </w:rPr>
+    </w:lvl>
+    <w:lvl w:ilvl="3" w:tentative="1">
+      <w:start w:val="1"/>
+      <w:numFmt w:val="bullet"/>
+      <w:lvlText w:val=""/>
+      <w:lvlJc w:val="left"/>
+      <w:pPr>
+        <w:tabs>
+          <w:tab w:val="num" w:pos="2880"/>
+        </w:tabs>
+        <w:ind w:left="2880" w:hanging="360"/>
+      </w:pPr>
+      <w:rPr>
+        <w:rFonts w:ascii="Wingdings" w:hAnsi="Wingdings" w:hint="default"/>
+        <w:sz w:val="20"/>
+      </w:rPr>
+    </w:lvl>
+    <w:lvl w:ilvl="4" w:tentative="1">
+      <w:start w:val="1"/>
+      <w:numFmt w:val="bullet"/>
+      <w:lvlText w:val=""/>
+      <w:lvlJc w:val="left"/>
+      <w:pPr>
+        <w:tabs>
+          <w:tab w:val="num" w:pos="3600"/>
+        </w:tabs>
+        <w:ind w:left="3600" w:hanging="360"/>
+      </w:pPr>
+      <w:rPr>
+        <w:rFonts w:ascii="Wingdings" w:hAnsi="Wingdings" w:hint="default"/>
+        <w:sz w:val="20"/>
+      </w:rPr>
+    </w:lvl>
+    <w:lvl w:ilvl="5" w:tentative="1">
+      <w:start w:val="1"/>
+      <w:numFmt w:val="bullet"/>
+      <w:lvlText w:val=""/>
+      <w:lvlJc w:val="left"/>
+      <w:pPr>
+        <w:tabs>
+          <w:tab w:val="num" w:pos="4320"/>
+        </w:tabs>
+        <w:ind w:left="4320" w:hanging="360"/>
+      </w:pPr>
+      <w:rPr>
+        <w:rFonts w:ascii="Wingdings" w:hAnsi="Wingdings" w:hint="default"/>
+        <w:sz w:val="20"/>
+      </w:rPr>
+    </w:lvl>
+    <w:lvl w:ilvl="6" w:tentative="1">
+      <w:start w:val="1"/>
+      <w:numFmt w:val="bullet"/>
+      <w:lvlText w:val=""/>
+      <w:lvlJc w:val="left"/>
+      <w:pPr>
+        <w:tabs>
+          <w:tab w:val="num" w:pos="5040"/>
+        </w:tabs>
+        <w:ind w:left="5040" w:hanging="360"/>
+      </w:pPr>
+      <w:rPr>
+        <w:rFonts w:ascii="Wingdings" w:hAnsi="Wingdings" w:hint="default"/>
+        <w:sz w:val="20"/>
+      </w:rPr>
+    </w:lvl>
+    <w:lvl w:ilvl="7" w:tentative="1">
+      <w:start w:val="1"/>
+      <w:numFmt w:val="bullet"/>
+      <w:lvlText w:val=""/>
+      <w:lvlJc w:val="left"/>
+      <w:pPr>
+        <w:tabs>
+          <w:tab w:val="num" w:pos="5760"/>
+        </w:tabs>
+        <w:ind w:left="5760" w:hanging="360"/>
+      </w:pPr>
+      <w:rPr>
+        <w:rFonts w:ascii="Wingdings" w:hAnsi="Wingdings" w:hint="default"/>
+        <w:sz w:val="20"/>
+      </w:rPr>
+    </w:lvl>
+    <w:lvl w:ilvl="8" w:tentative="1">
+      <w:start w:val="1"/>
+      <w:numFmt w:val="bullet"/>
+      <w:lvlText w:val=""/>
+      <w:lvlJc w:val="left"/>
+      <w:pPr>
+        <w:tabs>
+          <w:tab w:val="num" w:pos="6480"/>
+        </w:tabs>
+        <w:ind w:left="6480" w:hanging="360"/>
+      </w:pPr>
+      <w:rPr>
+        <w:rFonts w:ascii="Wingdings" w:hAnsi="Wingdings" w:hint="default"/>
+        <w:sz w:val="20"/>
+      </w:rPr>
+    </w:lvl>
+  </w:abstractNum>
+  <w:abstractNum w:abstractNumId="2" w15:restartNumberingAfterBreak="0">
+    <w:nsid w:val="191D3070"/>
+    <w:multiLevelType w:val="multilevel"/>
+    <w:tmpl w:val="F97A5FE4"/>
+    <w:lvl w:ilvl="0">
+      <w:start w:val="1"/>
+      <w:numFmt w:val="bullet"/>
+      <w:lvlText w:val=""/>
+      <w:lvlJc w:val="left"/>
+      <w:pPr>
+        <w:tabs>
+          <w:tab w:val="num" w:pos="720"/>
+        </w:tabs>
+        <w:ind w:left="720" w:hanging="360"/>
+      </w:pPr>
+      <w:rPr>
+        <w:rFonts w:ascii="Symbol" w:hAnsi="Symbol" w:hint="default"/>
+        <w:sz w:val="20"/>
+      </w:rPr>
+    </w:lvl>
+    <w:lvl w:ilvl="1">
+      <w:start w:val="1"/>
+      <w:numFmt w:val="bullet"/>
+      <w:lvlText w:val="o"/>
+      <w:lvlJc w:val="left"/>
+      <w:pPr>
+        <w:tabs>
+          <w:tab w:val="num" w:pos="1440"/>
+        </w:tabs>
+        <w:ind w:left="1440" w:hanging="360"/>
+      </w:pPr>
+      <w:rPr>
+        <w:rFonts w:ascii="Courier New" w:hAnsi="Courier New" w:hint="default"/>
+        <w:sz w:val="20"/>
+      </w:rPr>
+    </w:lvl>
+    <w:lvl w:ilvl="2" w:tentative="1">
+      <w:start w:val="1"/>
+      <w:numFmt w:val="bullet"/>
+      <w:lvlText w:val=""/>
+      <w:lvlJc w:val="left"/>
+      <w:pPr>
+        <w:tabs>
+          <w:tab w:val="num" w:pos="2160"/>
+        </w:tabs>
+        <w:ind w:left="2160" w:hanging="360"/>
+      </w:pPr>
+      <w:rPr>
+        <w:rFonts w:ascii="Wingdings" w:hAnsi="Wingdings" w:hint="default"/>
+        <w:sz w:val="20"/>
+      </w:rPr>
+    </w:lvl>
+    <w:lvl w:ilvl="3" w:tentative="1">
+      <w:start w:val="1"/>
+      <w:numFmt w:val="bullet"/>
+      <w:lvlText w:val=""/>
+      <w:lvlJc w:val="left"/>
+      <w:pPr>
+        <w:tabs>
+          <w:tab w:val="num" w:pos="2880"/>
+        </w:tabs>
+        <w:ind w:left="2880" w:hanging="360"/>
+      </w:pPr>
+      <w:rPr>
+        <w:rFonts w:ascii="Wingdings" w:hAnsi="Wingdings" w:hint="default"/>
+        <w:sz w:val="20"/>
+      </w:rPr>
+    </w:lvl>
+    <w:lvl w:ilvl="4" w:tentative="1">
+      <w:start w:val="1"/>
+      <w:numFmt w:val="bullet"/>
+      <w:lvlText w:val=""/>
+      <w:lvlJc w:val="left"/>
+      <w:pPr>
+        <w:tabs>
+          <w:tab w:val="num" w:pos="3600"/>
+        </w:tabs>
+        <w:ind w:left="3600" w:hanging="360"/>
+      </w:pPr>
+      <w:rPr>
+        <w:rFonts w:ascii="Wingdings" w:hAnsi="Wingdings" w:hint="default"/>
+        <w:sz w:val="20"/>
+      </w:rPr>
+    </w:lvl>
+    <w:lvl w:ilvl="5" w:tentative="1">
+      <w:start w:val="1"/>
+      <w:numFmt w:val="bullet"/>
+      <w:lvlText w:val=""/>
+      <w:lvlJc w:val="left"/>
+      <w:pPr>
+        <w:tabs>
+          <w:tab w:val="num" w:pos="4320"/>
+        </w:tabs>
+        <w:ind w:left="4320" w:hanging="360"/>
+      </w:pPr>
+      <w:rPr>
+        <w:rFonts w:ascii="Wingdings" w:hAnsi="Wingdings" w:hint="default"/>
+        <w:sz w:val="20"/>
+      </w:rPr>
+    </w:lvl>
+    <w:lvl w:ilvl="6" w:tentative="1">
+      <w:start w:val="1"/>
+      <w:numFmt w:val="bullet"/>
+      <w:lvlText w:val=""/>
+      <w:lvlJc w:val="left"/>
+      <w:pPr>
+        <w:tabs>
+          <w:tab w:val="num" w:pos="5040"/>
+        </w:tabs>
+        <w:ind w:left="5040" w:hanging="360"/>
+      </w:pPr>
+      <w:rPr>
+        <w:rFonts w:ascii="Wingdings" w:hAnsi="Wingdings" w:hint="default"/>
+        <w:sz w:val="20"/>
+      </w:rPr>
+    </w:lvl>
+    <w:lvl w:ilvl="7" w:tentative="1">
+      <w:start w:val="1"/>
+      <w:numFmt w:val="bullet"/>
+      <w:lvlText w:val=""/>
+      <w:lvlJc w:val="left"/>
+      <w:pPr>
+        <w:tabs>
+          <w:tab w:val="num" w:pos="5760"/>
+        </w:tabs>
+        <w:ind w:left="5760" w:hanging="360"/>
+      </w:pPr>
+      <w:rPr>
+        <w:rFonts w:ascii="Wingdings" w:hAnsi="Wingdings" w:hint="default"/>
+        <w:sz w:val="20"/>
+      </w:rPr>
+    </w:lvl>
+    <w:lvl w:ilvl="8" w:tentative="1">
+      <w:start w:val="1"/>
+      <w:numFmt w:val="bullet"/>
+      <w:lvlText w:val=""/>
+      <w:lvlJc w:val="left"/>
+      <w:pPr>
+        <w:tabs>
+          <w:tab w:val="num" w:pos="6480"/>
+        </w:tabs>
+        <w:ind w:left="6480" w:hanging="360"/>
+      </w:pPr>
+      <w:rPr>
+        <w:rFonts w:ascii="Wingdings" w:hAnsi="Wingdings" w:hint="default"/>
+        <w:sz w:val="20"/>
+      </w:rPr>
+    </w:lvl>
+  </w:abstractNum>
+  <w:abstractNum w:abstractNumId="3" w15:restartNumberingAfterBreak="0">
+    <w:nsid w:val="1F430AF2"/>
+    <w:multiLevelType w:val="multilevel"/>
+    <w:tmpl w:val="4E5EDAEA"/>
+    <w:lvl w:ilvl="0">
+      <w:start w:val="1"/>
+      <w:numFmt w:val="bullet"/>
+      <w:lvlText w:val=""/>
+      <w:lvlJc w:val="left"/>
+      <w:pPr>
+        <w:tabs>
+          <w:tab w:val="num" w:pos="720"/>
+        </w:tabs>
+        <w:ind w:left="720" w:hanging="360"/>
+      </w:pPr>
+      <w:rPr>
+        <w:rFonts w:ascii="Symbol" w:hAnsi="Symbol" w:hint="default"/>
+        <w:sz w:val="20"/>
+      </w:rPr>
+    </w:lvl>
+    <w:lvl w:ilvl="1" w:tentative="1">
+      <w:start w:val="1"/>
+      <w:numFmt w:val="bullet"/>
+      <w:lvlText w:val="o"/>
+      <w:lvlJc w:val="left"/>
+      <w:pPr>
+        <w:tabs>
+          <w:tab w:val="num" w:pos="1440"/>
+        </w:tabs>
+        <w:ind w:left="1440" w:hanging="360"/>
+      </w:pPr>
+      <w:rPr>
+        <w:rFonts w:ascii="Courier New" w:hAnsi="Courier New" w:hint="default"/>
+        <w:sz w:val="20"/>
+      </w:rPr>
+    </w:lvl>
+    <w:lvl w:ilvl="2" w:tentative="1">
+      <w:start w:val="1"/>
+      <w:numFmt w:val="bullet"/>
+      <w:lvlText w:val=""/>
+      <w:lvlJc w:val="left"/>
+      <w:pPr>
+        <w:tabs>
+          <w:tab w:val="num" w:pos="2160"/>
+        </w:tabs>
+        <w:ind w:left="2160" w:hanging="360"/>
+      </w:pPr>
+      <w:rPr>
+        <w:rFonts w:ascii="Wingdings" w:hAnsi="Wingdings" w:hint="default"/>
+        <w:sz w:val="20"/>
+      </w:rPr>
+    </w:lvl>
+    <w:lvl w:ilvl="3" w:tentative="1">
+      <w:start w:val="1"/>
+      <w:numFmt w:val="bullet"/>
+      <w:lvlText w:val=""/>
+      <w:lvlJc w:val="left"/>
+      <w:pPr>
+        <w:tabs>
+          <w:tab w:val="num" w:pos="2880"/>
+        </w:tabs>
+        <w:ind w:left="2880" w:hanging="360"/>
+      </w:pPr>
+      <w:rPr>
+        <w:rFonts w:ascii="Wingdings" w:hAnsi="Wingdings" w:hint="default"/>
+        <w:sz w:val="20"/>
+      </w:rPr>
+    </w:lvl>
+    <w:lvl w:ilvl="4" w:tentative="1">
+      <w:start w:val="1"/>
+      <w:numFmt w:val="bullet"/>
+      <w:lvlText w:val=""/>
+      <w:lvlJc w:val="left"/>
+      <w:pPr>
+        <w:tabs>
+          <w:tab w:val="num" w:pos="3600"/>
+        </w:tabs>
+        <w:ind w:left="3600" w:hanging="360"/>
+      </w:pPr>
+      <w:rPr>
+        <w:rFonts w:ascii="Wingdings" w:hAnsi="Wingdings" w:hint="default"/>
+        <w:sz w:val="20"/>
+      </w:rPr>
+    </w:lvl>
+    <w:lvl w:ilvl="5" w:tentative="1">
+      <w:start w:val="1"/>
+      <w:numFmt w:val="bullet"/>
+      <w:lvlText w:val=""/>
+      <w:lvlJc w:val="left"/>
+      <w:pPr>
+        <w:tabs>
+          <w:tab w:val="num" w:pos="4320"/>
+        </w:tabs>
+        <w:ind w:left="4320" w:hanging="360"/>
+      </w:pPr>
+      <w:rPr>
+        <w:rFonts w:ascii="Wingdings" w:hAnsi="Wingdings" w:hint="default"/>
+        <w:sz w:val="20"/>
+      </w:rPr>
+    </w:lvl>
+    <w:lvl w:ilvl="6" w:tentative="1">
+      <w:start w:val="1"/>
+      <w:numFmt w:val="bullet"/>
+      <w:lvlText w:val=""/>
+      <w:lvlJc w:val="left"/>
+      <w:pPr>
+        <w:tabs>
+          <w:tab w:val="num" w:pos="5040"/>
+        </w:tabs>
+        <w:ind w:left="5040" w:hanging="360"/>
+      </w:pPr>
+      <w:rPr>
+        <w:rFonts w:ascii="Wingdings" w:hAnsi="Wingdings" w:hint="default"/>
+        <w:sz w:val="20"/>
+      </w:rPr>
+    </w:lvl>
+    <w:lvl w:ilvl="7" w:tentative="1">
+      <w:start w:val="1"/>
+      <w:numFmt w:val="bullet"/>
+      <w:lvlText w:val=""/>
+      <w:lvlJc w:val="left"/>
+      <w:pPr>
+        <w:tabs>
+          <w:tab w:val="num" w:pos="5760"/>
+        </w:tabs>
+        <w:ind w:left="5760" w:hanging="360"/>
+      </w:pPr>
+      <w:rPr>
+        <w:rFonts w:ascii="Wingdings" w:hAnsi="Wingdings" w:hint="default"/>
+        <w:sz w:val="20"/>
+      </w:rPr>
+    </w:lvl>
+    <w:lvl w:ilvl="8" w:tentative="1">
+      <w:start w:val="1"/>
+      <w:numFmt w:val="bullet"/>
+      <w:lvlText w:val=""/>
+      <w:lvlJc w:val="left"/>
+      <w:pPr>
+        <w:tabs>
+          <w:tab w:val="num" w:pos="6480"/>
+        </w:tabs>
+        <w:ind w:left="6480" w:hanging="360"/>
+      </w:pPr>
+      <w:rPr>
+        <w:rFonts w:ascii="Wingdings" w:hAnsi="Wingdings" w:hint="default"/>
+        <w:sz w:val="20"/>
+      </w:rPr>
+    </w:lvl>
+  </w:abstractNum>
+  <w:abstractNum w:abstractNumId="4" w15:restartNumberingAfterBreak="0">
     <w:nsid w:val="20050D3D"/>
     <w:multiLevelType w:val="multilevel"/>
     <w:tmpl w:val="3EB40B7A"/>
@@ -1671,7 +3720,156 @@
       </w:rPr>
     </w:lvl>
   </w:abstractNum>
-  <w:abstractNum w:abstractNumId="2" w15:restartNumberingAfterBreak="0">
+  <w:abstractNum w:abstractNumId="5" w15:restartNumberingAfterBreak="0">
+    <w:nsid w:val="28CF39BE"/>
+    <w:multiLevelType w:val="multilevel"/>
+    <w:tmpl w:val="CD4C748A"/>
+    <w:lvl w:ilvl="0">
+      <w:start w:val="1"/>
+      <w:numFmt w:val="bullet"/>
+      <w:lvlText w:val=""/>
+      <w:lvlJc w:val="left"/>
+      <w:pPr>
+        <w:tabs>
+          <w:tab w:val="num" w:pos="720"/>
+        </w:tabs>
+        <w:ind w:left="720" w:hanging="360"/>
+      </w:pPr>
+      <w:rPr>
+        <w:rFonts w:ascii="Symbol" w:hAnsi="Symbol" w:hint="default"/>
+        <w:sz w:val="20"/>
+      </w:rPr>
+    </w:lvl>
+    <w:lvl w:ilvl="1" w:tentative="1">
+      <w:start w:val="1"/>
+      <w:numFmt w:val="bullet"/>
+      <w:lvlText w:val="o"/>
+      <w:lvlJc w:val="left"/>
+      <w:pPr>
+        <w:tabs>
+          <w:tab w:val="num" w:pos="1440"/>
+        </w:tabs>
+        <w:ind w:left="1440" w:hanging="360"/>
+      </w:pPr>
+      <w:rPr>
+        <w:rFonts w:ascii="Courier New" w:hAnsi="Courier New" w:hint="default"/>
+        <w:sz w:val="20"/>
+      </w:rPr>
+    </w:lvl>
+    <w:lvl w:ilvl="2" w:tentative="1">
+      <w:start w:val="1"/>
+      <w:numFmt w:val="bullet"/>
+      <w:lvlText w:val=""/>
+      <w:lvlJc w:val="left"/>
+      <w:pPr>
+        <w:tabs>
+          <w:tab w:val="num" w:pos="2160"/>
+        </w:tabs>
+        <w:ind w:left="2160" w:hanging="360"/>
+      </w:pPr>
+      <w:rPr>
+        <w:rFonts w:ascii="Wingdings" w:hAnsi="Wingdings" w:hint="default"/>
+        <w:sz w:val="20"/>
+      </w:rPr>
+    </w:lvl>
+    <w:lvl w:ilvl="3" w:tentative="1">
+      <w:start w:val="1"/>
+      <w:numFmt w:val="bullet"/>
+      <w:lvlText w:val=""/>
+      <w:lvlJc w:val="left"/>
+      <w:pPr>
+        <w:tabs>
+          <w:tab w:val="num" w:pos="2880"/>
+        </w:tabs>
+        <w:ind w:left="2880" w:hanging="360"/>
+      </w:pPr>
+      <w:rPr>
+        <w:rFonts w:ascii="Wingdings" w:hAnsi="Wingdings" w:hint="default"/>
+        <w:sz w:val="20"/>
+      </w:rPr>
+    </w:lvl>
+    <w:lvl w:ilvl="4" w:tentative="1">
+      <w:start w:val="1"/>
+      <w:numFmt w:val="bullet"/>
+      <w:lvlText w:val=""/>
+      <w:lvlJc w:val="left"/>
+      <w:pPr>
+        <w:tabs>
+          <w:tab w:val="num" w:pos="3600"/>
+        </w:tabs>
+        <w:ind w:left="3600" w:hanging="360"/>
+      </w:pPr>
+      <w:rPr>
+        <w:rFonts w:ascii="Wingdings" w:hAnsi="Wingdings" w:hint="default"/>
+        <w:sz w:val="20"/>
+      </w:rPr>
+    </w:lvl>
+    <w:lvl w:ilvl="5" w:tentative="1">
+      <w:start w:val="1"/>
+      <w:numFmt w:val="bullet"/>
+      <w:lvlText w:val=""/>
+      <w:lvlJc w:val="left"/>
+      <w:pPr>
+        <w:tabs>
+          <w:tab w:val="num" w:pos="4320"/>
+        </w:tabs>
+        <w:ind w:left="4320" w:hanging="360"/>
+      </w:pPr>
+      <w:rPr>
+        <w:rFonts w:ascii="Wingdings" w:hAnsi="Wingdings" w:hint="default"/>
+        <w:sz w:val="20"/>
+      </w:rPr>
+    </w:lvl>
+    <w:lvl w:ilvl="6" w:tentative="1">
+      <w:start w:val="1"/>
+      <w:numFmt w:val="bullet"/>
+      <w:lvlText w:val=""/>
+      <w:lvlJc w:val="left"/>
+      <w:pPr>
+        <w:tabs>
+          <w:tab w:val="num" w:pos="5040"/>
+        </w:tabs>
+        <w:ind w:left="5040" w:hanging="360"/>
+      </w:pPr>
+      <w:rPr>
+        <w:rFonts w:ascii="Wingdings" w:hAnsi="Wingdings" w:hint="default"/>
+        <w:sz w:val="20"/>
+      </w:rPr>
+    </w:lvl>
+    <w:lvl w:ilvl="7" w:tentative="1">
+      <w:start w:val="1"/>
+      <w:numFmt w:val="bullet"/>
+      <w:lvlText w:val=""/>
+      <w:lvlJc w:val="left"/>
+      <w:pPr>
+        <w:tabs>
+          <w:tab w:val="num" w:pos="5760"/>
+        </w:tabs>
+        <w:ind w:left="5760" w:hanging="360"/>
+      </w:pPr>
+      <w:rPr>
+        <w:rFonts w:ascii="Wingdings" w:hAnsi="Wingdings" w:hint="default"/>
+        <w:sz w:val="20"/>
+      </w:rPr>
+    </w:lvl>
+    <w:lvl w:ilvl="8" w:tentative="1">
+      <w:start w:val="1"/>
+      <w:numFmt w:val="bullet"/>
+      <w:lvlText w:val=""/>
+      <w:lvlJc w:val="left"/>
+      <w:pPr>
+        <w:tabs>
+          <w:tab w:val="num" w:pos="6480"/>
+        </w:tabs>
+        <w:ind w:left="6480" w:hanging="360"/>
+      </w:pPr>
+      <w:rPr>
+        <w:rFonts w:ascii="Wingdings" w:hAnsi="Wingdings" w:hint="default"/>
+        <w:sz w:val="20"/>
+      </w:rPr>
+    </w:lvl>
+  </w:abstractNum>
+  <w:abstractNum w:abstractNumId="6" w15:restartNumberingAfterBreak="0">
     <w:nsid w:val="29543C6C"/>
     <w:multiLevelType w:val="multilevel"/>
     <w:tmpl w:val="96A4A61E"/>
@@ -1820,7 +4018,305 @@
       </w:rPr>
     </w:lvl>
   </w:abstractNum>
-  <w:abstractNum w:abstractNumId="3" w15:restartNumberingAfterBreak="0">
+  <w:abstractNum w:abstractNumId="7" w15:restartNumberingAfterBreak="0">
+    <w:nsid w:val="2D7938D3"/>
+    <w:multiLevelType w:val="multilevel"/>
+    <w:tmpl w:val="78DE4428"/>
+    <w:lvl w:ilvl="0">
+      <w:start w:val="1"/>
+      <w:numFmt w:val="bullet"/>
+      <w:lvlText w:val=""/>
+      <w:lvlJc w:val="left"/>
+      <w:pPr>
+        <w:tabs>
+          <w:tab w:val="num" w:pos="720"/>
+        </w:tabs>
+        <w:ind w:left="720" w:hanging="360"/>
+      </w:pPr>
+      <w:rPr>
+        <w:rFonts w:ascii="Symbol" w:hAnsi="Symbol" w:hint="default"/>
+        <w:sz w:val="20"/>
+      </w:rPr>
+    </w:lvl>
+    <w:lvl w:ilvl="1" w:tentative="1">
+      <w:start w:val="1"/>
+      <w:numFmt w:val="bullet"/>
+      <w:lvlText w:val="o"/>
+      <w:lvlJc w:val="left"/>
+      <w:pPr>
+        <w:tabs>
+          <w:tab w:val="num" w:pos="1440"/>
+        </w:tabs>
+        <w:ind w:left="1440" w:hanging="360"/>
+      </w:pPr>
+      <w:rPr>
+        <w:rFonts w:ascii="Courier New" w:hAnsi="Courier New" w:hint="default"/>
+        <w:sz w:val="20"/>
+      </w:rPr>
+    </w:lvl>
+    <w:lvl w:ilvl="2" w:tentative="1">
+      <w:start w:val="1"/>
+      <w:numFmt w:val="bullet"/>
+      <w:lvlText w:val=""/>
+      <w:lvlJc w:val="left"/>
+      <w:pPr>
+        <w:tabs>
+          <w:tab w:val="num" w:pos="2160"/>
+        </w:tabs>
+        <w:ind w:left="2160" w:hanging="360"/>
+      </w:pPr>
+      <w:rPr>
+        <w:rFonts w:ascii="Wingdings" w:hAnsi="Wingdings" w:hint="default"/>
+        <w:sz w:val="20"/>
+      </w:rPr>
+    </w:lvl>
+    <w:lvl w:ilvl="3" w:tentative="1">
+      <w:start w:val="1"/>
+      <w:numFmt w:val="bullet"/>
+      <w:lvlText w:val=""/>
+      <w:lvlJc w:val="left"/>
+      <w:pPr>
+        <w:tabs>
+          <w:tab w:val="num" w:pos="2880"/>
+        </w:tabs>
+        <w:ind w:left="2880" w:hanging="360"/>
+      </w:pPr>
+      <w:rPr>
+        <w:rFonts w:ascii="Wingdings" w:hAnsi="Wingdings" w:hint="default"/>
+        <w:sz w:val="20"/>
+      </w:rPr>
+    </w:lvl>
+    <w:lvl w:ilvl="4" w:tentative="1">
+      <w:start w:val="1"/>
+      <w:numFmt w:val="bullet"/>
+      <w:lvlText w:val=""/>
+      <w:lvlJc w:val="left"/>
+      <w:pPr>
+        <w:tabs>
+          <w:tab w:val="num" w:pos="3600"/>
+        </w:tabs>
+        <w:ind w:left="3600" w:hanging="360"/>
+      </w:pPr>
+      <w:rPr>
+        <w:rFonts w:ascii="Wingdings" w:hAnsi="Wingdings" w:hint="default"/>
+        <w:sz w:val="20"/>
+      </w:rPr>
+    </w:lvl>
+    <w:lvl w:ilvl="5" w:tentative="1">
+      <w:start w:val="1"/>
+      <w:numFmt w:val="bullet"/>
+      <w:lvlText w:val=""/>
+      <w:lvlJc w:val="left"/>
+      <w:pPr>
+        <w:tabs>
+          <w:tab w:val="num" w:pos="4320"/>
+        </w:tabs>
+        <w:ind w:left="4320" w:hanging="360"/>
+      </w:pPr>
+      <w:rPr>
+        <w:rFonts w:ascii="Wingdings" w:hAnsi="Wingdings" w:hint="default"/>
+        <w:sz w:val="20"/>
+      </w:rPr>
+    </w:lvl>
+    <w:lvl w:ilvl="6" w:tentative="1">
+      <w:start w:val="1"/>
+      <w:numFmt w:val="bullet"/>
+      <w:lvlText w:val=""/>
+      <w:lvlJc w:val="left"/>
+      <w:pPr>
+        <w:tabs>
+          <w:tab w:val="num" w:pos="5040"/>
+        </w:tabs>
+        <w:ind w:left="5040" w:hanging="360"/>
+      </w:pPr>
+      <w:rPr>
+        <w:rFonts w:ascii="Wingdings" w:hAnsi="Wingdings" w:hint="default"/>
+        <w:sz w:val="20"/>
+      </w:rPr>
+    </w:lvl>
+    <w:lvl w:ilvl="7" w:tentative="1">
+      <w:start w:val="1"/>
+      <w:numFmt w:val="bullet"/>
+      <w:lvlText w:val=""/>
+      <w:lvlJc w:val="left"/>
+      <w:pPr>
+        <w:tabs>
+          <w:tab w:val="num" w:pos="5760"/>
+        </w:tabs>
+        <w:ind w:left="5760" w:hanging="360"/>
+      </w:pPr>
+      <w:rPr>
+        <w:rFonts w:ascii="Wingdings" w:hAnsi="Wingdings" w:hint="default"/>
+        <w:sz w:val="20"/>
+      </w:rPr>
+    </w:lvl>
+    <w:lvl w:ilvl="8" w:tentative="1">
+      <w:start w:val="1"/>
+      <w:numFmt w:val="bullet"/>
+      <w:lvlText w:val=""/>
+      <w:lvlJc w:val="left"/>
+      <w:pPr>
+        <w:tabs>
+          <w:tab w:val="num" w:pos="6480"/>
+        </w:tabs>
+        <w:ind w:left="6480" w:hanging="360"/>
+      </w:pPr>
+      <w:rPr>
+        <w:rFonts w:ascii="Wingdings" w:hAnsi="Wingdings" w:hint="default"/>
+        <w:sz w:val="20"/>
+      </w:rPr>
+    </w:lvl>
+  </w:abstractNum>
+  <w:abstractNum w:abstractNumId="8" w15:restartNumberingAfterBreak="0">
+    <w:nsid w:val="37087176"/>
+    <w:multiLevelType w:val="multilevel"/>
+    <w:tmpl w:val="FE9E98BE"/>
+    <w:lvl w:ilvl="0">
+      <w:start w:val="1"/>
+      <w:numFmt w:val="bullet"/>
+      <w:lvlText w:val=""/>
+      <w:lvlJc w:val="left"/>
+      <w:pPr>
+        <w:tabs>
+          <w:tab w:val="num" w:pos="720"/>
+        </w:tabs>
+        <w:ind w:left="720" w:hanging="360"/>
+      </w:pPr>
+      <w:rPr>
+        <w:rFonts w:ascii="Symbol" w:hAnsi="Symbol" w:hint="default"/>
+        <w:sz w:val="20"/>
+      </w:rPr>
+    </w:lvl>
+    <w:lvl w:ilvl="1" w:tentative="1">
+      <w:start w:val="1"/>
+      <w:numFmt w:val="bullet"/>
+      <w:lvlText w:val="o"/>
+      <w:lvlJc w:val="left"/>
+      <w:pPr>
+        <w:tabs>
+          <w:tab w:val="num" w:pos="1440"/>
+        </w:tabs>
+        <w:ind w:left="1440" w:hanging="360"/>
+      </w:pPr>
+      <w:rPr>
+        <w:rFonts w:ascii="Courier New" w:hAnsi="Courier New" w:hint="default"/>
+        <w:sz w:val="20"/>
+      </w:rPr>
+    </w:lvl>
+    <w:lvl w:ilvl="2" w:tentative="1">
+      <w:start w:val="1"/>
+      <w:numFmt w:val="bullet"/>
+      <w:lvlText w:val=""/>
+      <w:lvlJc w:val="left"/>
+      <w:pPr>
+        <w:tabs>
+          <w:tab w:val="num" w:pos="2160"/>
+        </w:tabs>
+        <w:ind w:left="2160" w:hanging="360"/>
+      </w:pPr>
+      <w:rPr>
+        <w:rFonts w:ascii="Wingdings" w:hAnsi="Wingdings" w:hint="default"/>
+        <w:sz w:val="20"/>
+      </w:rPr>
+    </w:lvl>
+    <w:lvl w:ilvl="3" w:tentative="1">
+      <w:start w:val="1"/>
+      <w:numFmt w:val="bullet"/>
+      <w:lvlText w:val=""/>
+      <w:lvlJc w:val="left"/>
+      <w:pPr>
+        <w:tabs>
+          <w:tab w:val="num" w:pos="2880"/>
+        </w:tabs>
+        <w:ind w:left="2880" w:hanging="360"/>
+      </w:pPr>
+      <w:rPr>
+        <w:rFonts w:ascii="Wingdings" w:hAnsi="Wingdings" w:hint="default"/>
+        <w:sz w:val="20"/>
+      </w:rPr>
+    </w:lvl>
+    <w:lvl w:ilvl="4" w:tentative="1">
+      <w:start w:val="1"/>
+      <w:numFmt w:val="bullet"/>
+      <w:lvlText w:val=""/>
+      <w:lvlJc w:val="left"/>
+      <w:pPr>
+        <w:tabs>
+          <w:tab w:val="num" w:pos="3600"/>
+        </w:tabs>
+        <w:ind w:left="3600" w:hanging="360"/>
+      </w:pPr>
+      <w:rPr>
+        <w:rFonts w:ascii="Wingdings" w:hAnsi="Wingdings" w:hint="default"/>
+        <w:sz w:val="20"/>
+      </w:rPr>
+    </w:lvl>
+    <w:lvl w:ilvl="5" w:tentative="1">
+      <w:start w:val="1"/>
+      <w:numFmt w:val="bullet"/>
+      <w:lvlText w:val=""/>
+      <w:lvlJc w:val="left"/>
+      <w:pPr>
+        <w:tabs>
+          <w:tab w:val="num" w:pos="4320"/>
+        </w:tabs>
+        <w:ind w:left="4320" w:hanging="360"/>
+      </w:pPr>
+      <w:rPr>
+        <w:rFonts w:ascii="Wingdings" w:hAnsi="Wingdings" w:hint="default"/>
+        <w:sz w:val="20"/>
+      </w:rPr>
+    </w:lvl>
+    <w:lvl w:ilvl="6" w:tentative="1">
+      <w:start w:val="1"/>
+      <w:numFmt w:val="bullet"/>
+      <w:lvlText w:val=""/>
+      <w:lvlJc w:val="left"/>
+      <w:pPr>
+        <w:tabs>
+          <w:tab w:val="num" w:pos="5040"/>
+        </w:tabs>
+        <w:ind w:left="5040" w:hanging="360"/>
+      </w:pPr>
+      <w:rPr>
+        <w:rFonts w:ascii="Wingdings" w:hAnsi="Wingdings" w:hint="default"/>
+        <w:sz w:val="20"/>
+      </w:rPr>
+    </w:lvl>
+    <w:lvl w:ilvl="7" w:tentative="1">
+      <w:start w:val="1"/>
+      <w:numFmt w:val="bullet"/>
+      <w:lvlText w:val=""/>
+      <w:lvlJc w:val="left"/>
+      <w:pPr>
+        <w:tabs>
+          <w:tab w:val="num" w:pos="5760"/>
+        </w:tabs>
+        <w:ind w:left="5760" w:hanging="360"/>
+      </w:pPr>
+      <w:rPr>
+        <w:rFonts w:ascii="Wingdings" w:hAnsi="Wingdings" w:hint="default"/>
+        <w:sz w:val="20"/>
+      </w:rPr>
+    </w:lvl>
+    <w:lvl w:ilvl="8" w:tentative="1">
+      <w:start w:val="1"/>
+      <w:numFmt w:val="bullet"/>
+      <w:lvlText w:val=""/>
+      <w:lvlJc w:val="left"/>
+      <w:pPr>
+        <w:tabs>
+          <w:tab w:val="num" w:pos="6480"/>
+        </w:tabs>
+        <w:ind w:left="6480" w:hanging="360"/>
+      </w:pPr>
+      <w:rPr>
+        <w:rFonts w:ascii="Wingdings" w:hAnsi="Wingdings" w:hint="default"/>
+        <w:sz w:val="20"/>
+      </w:rPr>
+    </w:lvl>
+  </w:abstractNum>
+  <w:abstractNum w:abstractNumId="9" w15:restartNumberingAfterBreak="0">
     <w:nsid w:val="39B769D0"/>
     <w:multiLevelType w:val="multilevel"/>
     <w:tmpl w:val="264ECEFE"/>
@@ -1969,7 +4465,603 @@
       </w:rPr>
     </w:lvl>
   </w:abstractNum>
-  <w:abstractNum w:abstractNumId="4" w15:restartNumberingAfterBreak="0">
+  <w:abstractNum w:abstractNumId="10" w15:restartNumberingAfterBreak="0">
+    <w:nsid w:val="3A371384"/>
+    <w:multiLevelType w:val="multilevel"/>
+    <w:tmpl w:val="C0808624"/>
+    <w:lvl w:ilvl="0">
+      <w:start w:val="1"/>
+      <w:numFmt w:val="bullet"/>
+      <w:lvlText w:val=""/>
+      <w:lvlJc w:val="left"/>
+      <w:pPr>
+        <w:tabs>
+          <w:tab w:val="num" w:pos="720"/>
+        </w:tabs>
+        <w:ind w:left="720" w:hanging="360"/>
+      </w:pPr>
+      <w:rPr>
+        <w:rFonts w:ascii="Symbol" w:hAnsi="Symbol" w:hint="default"/>
+        <w:sz w:val="20"/>
+      </w:rPr>
+    </w:lvl>
+    <w:lvl w:ilvl="1" w:tentative="1">
+      <w:start w:val="1"/>
+      <w:numFmt w:val="bullet"/>
+      <w:lvlText w:val="o"/>
+      <w:lvlJc w:val="left"/>
+      <w:pPr>
+        <w:tabs>
+          <w:tab w:val="num" w:pos="1440"/>
+        </w:tabs>
+        <w:ind w:left="1440" w:hanging="360"/>
+      </w:pPr>
+      <w:rPr>
+        <w:rFonts w:ascii="Courier New" w:hAnsi="Courier New" w:hint="default"/>
+        <w:sz w:val="20"/>
+      </w:rPr>
+    </w:lvl>
+    <w:lvl w:ilvl="2" w:tentative="1">
+      <w:start w:val="1"/>
+      <w:numFmt w:val="bullet"/>
+      <w:lvlText w:val=""/>
+      <w:lvlJc w:val="left"/>
+      <w:pPr>
+        <w:tabs>
+          <w:tab w:val="num" w:pos="2160"/>
+        </w:tabs>
+        <w:ind w:left="2160" w:hanging="360"/>
+      </w:pPr>
+      <w:rPr>
+        <w:rFonts w:ascii="Wingdings" w:hAnsi="Wingdings" w:hint="default"/>
+        <w:sz w:val="20"/>
+      </w:rPr>
+    </w:lvl>
+    <w:lvl w:ilvl="3" w:tentative="1">
+      <w:start w:val="1"/>
+      <w:numFmt w:val="bullet"/>
+      <w:lvlText w:val=""/>
+      <w:lvlJc w:val="left"/>
+      <w:pPr>
+        <w:tabs>
+          <w:tab w:val="num" w:pos="2880"/>
+        </w:tabs>
+        <w:ind w:left="2880" w:hanging="360"/>
+      </w:pPr>
+      <w:rPr>
+        <w:rFonts w:ascii="Wingdings" w:hAnsi="Wingdings" w:hint="default"/>
+        <w:sz w:val="20"/>
+      </w:rPr>
+    </w:lvl>
+    <w:lvl w:ilvl="4" w:tentative="1">
+      <w:start w:val="1"/>
+      <w:numFmt w:val="bullet"/>
+      <w:lvlText w:val=""/>
+      <w:lvlJc w:val="left"/>
+      <w:pPr>
+        <w:tabs>
+          <w:tab w:val="num" w:pos="3600"/>
+        </w:tabs>
+        <w:ind w:left="3600" w:hanging="360"/>
+      </w:pPr>
+      <w:rPr>
+        <w:rFonts w:ascii="Wingdings" w:hAnsi="Wingdings" w:hint="default"/>
+        <w:sz w:val="20"/>
+      </w:rPr>
+    </w:lvl>
+    <w:lvl w:ilvl="5" w:tentative="1">
+      <w:start w:val="1"/>
+      <w:numFmt w:val="bullet"/>
+      <w:lvlText w:val=""/>
+      <w:lvlJc w:val="left"/>
+      <w:pPr>
+        <w:tabs>
+          <w:tab w:val="num" w:pos="4320"/>
+        </w:tabs>
+        <w:ind w:left="4320" w:hanging="360"/>
+      </w:pPr>
+      <w:rPr>
+        <w:rFonts w:ascii="Wingdings" w:hAnsi="Wingdings" w:hint="default"/>
+        <w:sz w:val="20"/>
+      </w:rPr>
+    </w:lvl>
+    <w:lvl w:ilvl="6" w:tentative="1">
+      <w:start w:val="1"/>
+      <w:numFmt w:val="bullet"/>
+      <w:lvlText w:val=""/>
+      <w:lvlJc w:val="left"/>
+      <w:pPr>
+        <w:tabs>
+          <w:tab w:val="num" w:pos="5040"/>
+        </w:tabs>
+        <w:ind w:left="5040" w:hanging="360"/>
+      </w:pPr>
+      <w:rPr>
+        <w:rFonts w:ascii="Wingdings" w:hAnsi="Wingdings" w:hint="default"/>
+        <w:sz w:val="20"/>
+      </w:rPr>
+    </w:lvl>
+    <w:lvl w:ilvl="7" w:tentative="1">
+      <w:start w:val="1"/>
+      <w:numFmt w:val="bullet"/>
+      <w:lvlText w:val=""/>
+      <w:lvlJc w:val="left"/>
+      <w:pPr>
+        <w:tabs>
+          <w:tab w:val="num" w:pos="5760"/>
+        </w:tabs>
+        <w:ind w:left="5760" w:hanging="360"/>
+      </w:pPr>
+      <w:rPr>
+        <w:rFonts w:ascii="Wingdings" w:hAnsi="Wingdings" w:hint="default"/>
+        <w:sz w:val="20"/>
+      </w:rPr>
+    </w:lvl>
+    <w:lvl w:ilvl="8" w:tentative="1">
+      <w:start w:val="1"/>
+      <w:numFmt w:val="bullet"/>
+      <w:lvlText w:val=""/>
+      <w:lvlJc w:val="left"/>
+      <w:pPr>
+        <w:tabs>
+          <w:tab w:val="num" w:pos="6480"/>
+        </w:tabs>
+        <w:ind w:left="6480" w:hanging="360"/>
+      </w:pPr>
+      <w:rPr>
+        <w:rFonts w:ascii="Wingdings" w:hAnsi="Wingdings" w:hint="default"/>
+        <w:sz w:val="20"/>
+      </w:rPr>
+    </w:lvl>
+  </w:abstractNum>
+  <w:abstractNum w:abstractNumId="11" w15:restartNumberingAfterBreak="0">
+    <w:nsid w:val="53D27617"/>
+    <w:multiLevelType w:val="multilevel"/>
+    <w:tmpl w:val="3650F8AE"/>
+    <w:lvl w:ilvl="0">
+      <w:start w:val="1"/>
+      <w:numFmt w:val="bullet"/>
+      <w:lvlText w:val=""/>
+      <w:lvlJc w:val="left"/>
+      <w:pPr>
+        <w:tabs>
+          <w:tab w:val="num" w:pos="720"/>
+        </w:tabs>
+        <w:ind w:left="720" w:hanging="360"/>
+      </w:pPr>
+      <w:rPr>
+        <w:rFonts w:ascii="Symbol" w:hAnsi="Symbol" w:hint="default"/>
+        <w:sz w:val="20"/>
+      </w:rPr>
+    </w:lvl>
+    <w:lvl w:ilvl="1" w:tentative="1">
+      <w:start w:val="1"/>
+      <w:numFmt w:val="bullet"/>
+      <w:lvlText w:val="o"/>
+      <w:lvlJc w:val="left"/>
+      <w:pPr>
+        <w:tabs>
+          <w:tab w:val="num" w:pos="1440"/>
+        </w:tabs>
+        <w:ind w:left="1440" w:hanging="360"/>
+      </w:pPr>
+      <w:rPr>
+        <w:rFonts w:ascii="Courier New" w:hAnsi="Courier New" w:hint="default"/>
+        <w:sz w:val="20"/>
+      </w:rPr>
+    </w:lvl>
+    <w:lvl w:ilvl="2" w:tentative="1">
+      <w:start w:val="1"/>
+      <w:numFmt w:val="bullet"/>
+      <w:lvlText w:val=""/>
+      <w:lvlJc w:val="left"/>
+      <w:pPr>
+        <w:tabs>
+          <w:tab w:val="num" w:pos="2160"/>
+        </w:tabs>
+        <w:ind w:left="2160" w:hanging="360"/>
+      </w:pPr>
+      <w:rPr>
+        <w:rFonts w:ascii="Wingdings" w:hAnsi="Wingdings" w:hint="default"/>
+        <w:sz w:val="20"/>
+      </w:rPr>
+    </w:lvl>
+    <w:lvl w:ilvl="3" w:tentative="1">
+      <w:start w:val="1"/>
+      <w:numFmt w:val="bullet"/>
+      <w:lvlText w:val=""/>
+      <w:lvlJc w:val="left"/>
+      <w:pPr>
+        <w:tabs>
+          <w:tab w:val="num" w:pos="2880"/>
+        </w:tabs>
+        <w:ind w:left="2880" w:hanging="360"/>
+      </w:pPr>
+      <w:rPr>
+        <w:rFonts w:ascii="Wingdings" w:hAnsi="Wingdings" w:hint="default"/>
+        <w:sz w:val="20"/>
+      </w:rPr>
+    </w:lvl>
+    <w:lvl w:ilvl="4" w:tentative="1">
+      <w:start w:val="1"/>
+      <w:numFmt w:val="bullet"/>
+      <w:lvlText w:val=""/>
+      <w:lvlJc w:val="left"/>
+      <w:pPr>
+        <w:tabs>
+          <w:tab w:val="num" w:pos="3600"/>
+        </w:tabs>
+        <w:ind w:left="3600" w:hanging="360"/>
+      </w:pPr>
+      <w:rPr>
+        <w:rFonts w:ascii="Wingdings" w:hAnsi="Wingdings" w:hint="default"/>
+        <w:sz w:val="20"/>
+      </w:rPr>
+    </w:lvl>
+    <w:lvl w:ilvl="5" w:tentative="1">
+      <w:start w:val="1"/>
+      <w:numFmt w:val="bullet"/>
+      <w:lvlText w:val=""/>
+      <w:lvlJc w:val="left"/>
+      <w:pPr>
+        <w:tabs>
+          <w:tab w:val="num" w:pos="4320"/>
+        </w:tabs>
+        <w:ind w:left="4320" w:hanging="360"/>
+      </w:pPr>
+      <w:rPr>
+        <w:rFonts w:ascii="Wingdings" w:hAnsi="Wingdings" w:hint="default"/>
+        <w:sz w:val="20"/>
+      </w:rPr>
+    </w:lvl>
+    <w:lvl w:ilvl="6" w:tentative="1">
+      <w:start w:val="1"/>
+      <w:numFmt w:val="bullet"/>
+      <w:lvlText w:val=""/>
+      <w:lvlJc w:val="left"/>
+      <w:pPr>
+        <w:tabs>
+          <w:tab w:val="num" w:pos="5040"/>
+        </w:tabs>
+        <w:ind w:left="5040" w:hanging="360"/>
+      </w:pPr>
+      <w:rPr>
+        <w:rFonts w:ascii="Wingdings" w:hAnsi="Wingdings" w:hint="default"/>
+        <w:sz w:val="20"/>
+      </w:rPr>
+    </w:lvl>
+    <w:lvl w:ilvl="7" w:tentative="1">
+      <w:start w:val="1"/>
+      <w:numFmt w:val="bullet"/>
+      <w:lvlText w:val=""/>
+      <w:lvlJc w:val="left"/>
+      <w:pPr>
+        <w:tabs>
+          <w:tab w:val="num" w:pos="5760"/>
+        </w:tabs>
+        <w:ind w:left="5760" w:hanging="360"/>
+      </w:pPr>
+      <w:rPr>
+        <w:rFonts w:ascii="Wingdings" w:hAnsi="Wingdings" w:hint="default"/>
+        <w:sz w:val="20"/>
+      </w:rPr>
+    </w:lvl>
+    <w:lvl w:ilvl="8" w:tentative="1">
+      <w:start w:val="1"/>
+      <w:numFmt w:val="bullet"/>
+      <w:lvlText w:val=""/>
+      <w:lvlJc w:val="left"/>
+      <w:pPr>
+        <w:tabs>
+          <w:tab w:val="num" w:pos="6480"/>
+        </w:tabs>
+        <w:ind w:left="6480" w:hanging="360"/>
+      </w:pPr>
+      <w:rPr>
+        <w:rFonts w:ascii="Wingdings" w:hAnsi="Wingdings" w:hint="default"/>
+        <w:sz w:val="20"/>
+      </w:rPr>
+    </w:lvl>
+  </w:abstractNum>
+  <w:abstractNum w:abstractNumId="12" w15:restartNumberingAfterBreak="0">
+    <w:nsid w:val="5EE53975"/>
+    <w:multiLevelType w:val="multilevel"/>
+    <w:tmpl w:val="18668594"/>
+    <w:lvl w:ilvl="0">
+      <w:start w:val="1"/>
+      <w:numFmt w:val="bullet"/>
+      <w:lvlText w:val=""/>
+      <w:lvlJc w:val="left"/>
+      <w:pPr>
+        <w:tabs>
+          <w:tab w:val="num" w:pos="720"/>
+        </w:tabs>
+        <w:ind w:left="720" w:hanging="360"/>
+      </w:pPr>
+      <w:rPr>
+        <w:rFonts w:ascii="Symbol" w:hAnsi="Symbol" w:hint="default"/>
+        <w:sz w:val="20"/>
+      </w:rPr>
+    </w:lvl>
+    <w:lvl w:ilvl="1" w:tentative="1">
+      <w:start w:val="1"/>
+      <w:numFmt w:val="bullet"/>
+      <w:lvlText w:val="o"/>
+      <w:lvlJc w:val="left"/>
+      <w:pPr>
+        <w:tabs>
+          <w:tab w:val="num" w:pos="1440"/>
+        </w:tabs>
+        <w:ind w:left="1440" w:hanging="360"/>
+      </w:pPr>
+      <w:rPr>
+        <w:rFonts w:ascii="Courier New" w:hAnsi="Courier New" w:hint="default"/>
+        <w:sz w:val="20"/>
+      </w:rPr>
+    </w:lvl>
+    <w:lvl w:ilvl="2" w:tentative="1">
+      <w:start w:val="1"/>
+      <w:numFmt w:val="bullet"/>
+      <w:lvlText w:val=""/>
+      <w:lvlJc w:val="left"/>
+      <w:pPr>
+        <w:tabs>
+          <w:tab w:val="num" w:pos="2160"/>
+        </w:tabs>
+        <w:ind w:left="2160" w:hanging="360"/>
+      </w:pPr>
+      <w:rPr>
+        <w:rFonts w:ascii="Wingdings" w:hAnsi="Wingdings" w:hint="default"/>
+        <w:sz w:val="20"/>
+      </w:rPr>
+    </w:lvl>
+    <w:lvl w:ilvl="3" w:tentative="1">
+      <w:start w:val="1"/>
+      <w:numFmt w:val="bullet"/>
+      <w:lvlText w:val=""/>
+      <w:lvlJc w:val="left"/>
+      <w:pPr>
+        <w:tabs>
+          <w:tab w:val="num" w:pos="2880"/>
+        </w:tabs>
+        <w:ind w:left="2880" w:hanging="360"/>
+      </w:pPr>
+      <w:rPr>
+        <w:rFonts w:ascii="Wingdings" w:hAnsi="Wingdings" w:hint="default"/>
+        <w:sz w:val="20"/>
+      </w:rPr>
+    </w:lvl>
+    <w:lvl w:ilvl="4" w:tentative="1">
+      <w:start w:val="1"/>
+      <w:numFmt w:val="bullet"/>
+      <w:lvlText w:val=""/>
+      <w:lvlJc w:val="left"/>
+      <w:pPr>
+        <w:tabs>
+          <w:tab w:val="num" w:pos="3600"/>
+        </w:tabs>
+        <w:ind w:left="3600" w:hanging="360"/>
+      </w:pPr>
+      <w:rPr>
+        <w:rFonts w:ascii="Wingdings" w:hAnsi="Wingdings" w:hint="default"/>
+        <w:sz w:val="20"/>
+      </w:rPr>
+    </w:lvl>
+    <w:lvl w:ilvl="5" w:tentative="1">
+      <w:start w:val="1"/>
+      <w:numFmt w:val="bullet"/>
+      <w:lvlText w:val=""/>
+      <w:lvlJc w:val="left"/>
+      <w:pPr>
+        <w:tabs>
+          <w:tab w:val="num" w:pos="4320"/>
+        </w:tabs>
+        <w:ind w:left="4320" w:hanging="360"/>
+      </w:pPr>
+      <w:rPr>
+        <w:rFonts w:ascii="Wingdings" w:hAnsi="Wingdings" w:hint="default"/>
+        <w:sz w:val="20"/>
+      </w:rPr>
+    </w:lvl>
+    <w:lvl w:ilvl="6" w:tentative="1">
+      <w:start w:val="1"/>
+      <w:numFmt w:val="bullet"/>
+      <w:lvlText w:val=""/>
+      <w:lvlJc w:val="left"/>
+      <w:pPr>
+        <w:tabs>
+          <w:tab w:val="num" w:pos="5040"/>
+        </w:tabs>
+        <w:ind w:left="5040" w:hanging="360"/>
+      </w:pPr>
+      <w:rPr>
+        <w:rFonts w:ascii="Wingdings" w:hAnsi="Wingdings" w:hint="default"/>
+        <w:sz w:val="20"/>
+      </w:rPr>
+    </w:lvl>
+    <w:lvl w:ilvl="7" w:tentative="1">
+      <w:start w:val="1"/>
+      <w:numFmt w:val="bullet"/>
+      <w:lvlText w:val=""/>
+      <w:lvlJc w:val="left"/>
+      <w:pPr>
+        <w:tabs>
+          <w:tab w:val="num" w:pos="5760"/>
+        </w:tabs>
+        <w:ind w:left="5760" w:hanging="360"/>
+      </w:pPr>
+      <w:rPr>
+        <w:rFonts w:ascii="Wingdings" w:hAnsi="Wingdings" w:hint="default"/>
+        <w:sz w:val="20"/>
+      </w:rPr>
+    </w:lvl>
+    <w:lvl w:ilvl="8" w:tentative="1">
+      <w:start w:val="1"/>
+      <w:numFmt w:val="bullet"/>
+      <w:lvlText w:val=""/>
+      <w:lvlJc w:val="left"/>
+      <w:pPr>
+        <w:tabs>
+          <w:tab w:val="num" w:pos="6480"/>
+        </w:tabs>
+        <w:ind w:left="6480" w:hanging="360"/>
+      </w:pPr>
+      <w:rPr>
+        <w:rFonts w:ascii="Wingdings" w:hAnsi="Wingdings" w:hint="default"/>
+        <w:sz w:val="20"/>
+      </w:rPr>
+    </w:lvl>
+  </w:abstractNum>
+  <w:abstractNum w:abstractNumId="13" w15:restartNumberingAfterBreak="0">
+    <w:nsid w:val="60B67BC9"/>
+    <w:multiLevelType w:val="multilevel"/>
+    <w:tmpl w:val="5558A702"/>
+    <w:lvl w:ilvl="0">
+      <w:start w:val="1"/>
+      <w:numFmt w:val="bullet"/>
+      <w:lvlText w:val=""/>
+      <w:lvlJc w:val="left"/>
+      <w:pPr>
+        <w:tabs>
+          <w:tab w:val="num" w:pos="720"/>
+        </w:tabs>
+        <w:ind w:left="720" w:hanging="360"/>
+      </w:pPr>
+      <w:rPr>
+        <w:rFonts w:ascii="Symbol" w:hAnsi="Symbol" w:hint="default"/>
+        <w:sz w:val="20"/>
+      </w:rPr>
+    </w:lvl>
+    <w:lvl w:ilvl="1" w:tentative="1">
+      <w:start w:val="1"/>
+      <w:numFmt w:val="bullet"/>
+      <w:lvlText w:val="o"/>
+      <w:lvlJc w:val="left"/>
+      <w:pPr>
+        <w:tabs>
+          <w:tab w:val="num" w:pos="1440"/>
+        </w:tabs>
+        <w:ind w:left="1440" w:hanging="360"/>
+      </w:pPr>
+      <w:rPr>
+        <w:rFonts w:ascii="Courier New" w:hAnsi="Courier New" w:hint="default"/>
+        <w:sz w:val="20"/>
+      </w:rPr>
+    </w:lvl>
+    <w:lvl w:ilvl="2" w:tentative="1">
+      <w:start w:val="1"/>
+      <w:numFmt w:val="bullet"/>
+      <w:lvlText w:val=""/>
+      <w:lvlJc w:val="left"/>
+      <w:pPr>
+        <w:tabs>
+          <w:tab w:val="num" w:pos="2160"/>
+        </w:tabs>
+        <w:ind w:left="2160" w:hanging="360"/>
+      </w:pPr>
+      <w:rPr>
+        <w:rFonts w:ascii="Wingdings" w:hAnsi="Wingdings" w:hint="default"/>
+        <w:sz w:val="20"/>
+      </w:rPr>
+    </w:lvl>
+    <w:lvl w:ilvl="3" w:tentative="1">
+      <w:start w:val="1"/>
+      <w:numFmt w:val="bullet"/>
+      <w:lvlText w:val=""/>
+      <w:lvlJc w:val="left"/>
+      <w:pPr>
+        <w:tabs>
+          <w:tab w:val="num" w:pos="2880"/>
+        </w:tabs>
+        <w:ind w:left="2880" w:hanging="360"/>
+      </w:pPr>
+      <w:rPr>
+        <w:rFonts w:ascii="Wingdings" w:hAnsi="Wingdings" w:hint="default"/>
+        <w:sz w:val="20"/>
+      </w:rPr>
+    </w:lvl>
+    <w:lvl w:ilvl="4" w:tentative="1">
+      <w:start w:val="1"/>
+      <w:numFmt w:val="bullet"/>
+      <w:lvlText w:val=""/>
+      <w:lvlJc w:val="left"/>
+      <w:pPr>
+        <w:tabs>
+          <w:tab w:val="num" w:pos="3600"/>
+        </w:tabs>
+        <w:ind w:left="3600" w:hanging="360"/>
+      </w:pPr>
+      <w:rPr>
+        <w:rFonts w:ascii="Wingdings" w:hAnsi="Wingdings" w:hint="default"/>
+        <w:sz w:val="20"/>
+      </w:rPr>
+    </w:lvl>
+    <w:lvl w:ilvl="5" w:tentative="1">
+      <w:start w:val="1"/>
+      <w:numFmt w:val="bullet"/>
+      <w:lvlText w:val=""/>
+      <w:lvlJc w:val="left"/>
+      <w:pPr>
+        <w:tabs>
+          <w:tab w:val="num" w:pos="4320"/>
+        </w:tabs>
+        <w:ind w:left="4320" w:hanging="360"/>
+      </w:pPr>
+      <w:rPr>
+        <w:rFonts w:ascii="Wingdings" w:hAnsi="Wingdings" w:hint="default"/>
+        <w:sz w:val="20"/>
+      </w:rPr>
+    </w:lvl>
+    <w:lvl w:ilvl="6" w:tentative="1">
+      <w:start w:val="1"/>
+      <w:numFmt w:val="bullet"/>
+      <w:lvlText w:val=""/>
+      <w:lvlJc w:val="left"/>
+      <w:pPr>
+        <w:tabs>
+          <w:tab w:val="num" w:pos="5040"/>
+        </w:tabs>
+        <w:ind w:left="5040" w:hanging="360"/>
+      </w:pPr>
+      <w:rPr>
+        <w:rFonts w:ascii="Wingdings" w:hAnsi="Wingdings" w:hint="default"/>
+        <w:sz w:val="20"/>
+      </w:rPr>
+    </w:lvl>
+    <w:lvl w:ilvl="7" w:tentative="1">
+      <w:start w:val="1"/>
+      <w:numFmt w:val="bullet"/>
+      <w:lvlText w:val=""/>
+      <w:lvlJc w:val="left"/>
+      <w:pPr>
+        <w:tabs>
+          <w:tab w:val="num" w:pos="5760"/>
+        </w:tabs>
+        <w:ind w:left="5760" w:hanging="360"/>
+      </w:pPr>
+      <w:rPr>
+        <w:rFonts w:ascii="Wingdings" w:hAnsi="Wingdings" w:hint="default"/>
+        <w:sz w:val="20"/>
+      </w:rPr>
+    </w:lvl>
+    <w:lvl w:ilvl="8" w:tentative="1">
+      <w:start w:val="1"/>
+      <w:numFmt w:val="bullet"/>
+      <w:lvlText w:val=""/>
+      <w:lvlJc w:val="left"/>
+      <w:pPr>
+        <w:tabs>
+          <w:tab w:val="num" w:pos="6480"/>
+        </w:tabs>
+        <w:ind w:left="6480" w:hanging="360"/>
+      </w:pPr>
+      <w:rPr>
+        <w:rFonts w:ascii="Wingdings" w:hAnsi="Wingdings" w:hint="default"/>
+        <w:sz w:val="20"/>
+      </w:rPr>
+    </w:lvl>
+  </w:abstractNum>
+  <w:abstractNum w:abstractNumId="14" w15:restartNumberingAfterBreak="0">
     <w:nsid w:val="69F10E3D"/>
     <w:multiLevelType w:val="multilevel"/>
     <w:tmpl w:val="CF2A3DF4"/>
@@ -2118,20 +5210,470 @@
       </w:rPr>
     </w:lvl>
   </w:abstractNum>
+  <w:abstractNum w:abstractNumId="15" w15:restartNumberingAfterBreak="0">
+    <w:nsid w:val="72B73771"/>
+    <w:multiLevelType w:val="multilevel"/>
+    <w:tmpl w:val="372A9FEA"/>
+    <w:lvl w:ilvl="0">
+      <w:start w:val="1"/>
+      <w:numFmt w:val="bullet"/>
+      <w:lvlText w:val=""/>
+      <w:lvlJc w:val="left"/>
+      <w:pPr>
+        <w:tabs>
+          <w:tab w:val="num" w:pos="720"/>
+        </w:tabs>
+        <w:ind w:left="720" w:hanging="360"/>
+      </w:pPr>
+      <w:rPr>
+        <w:rFonts w:ascii="Symbol" w:hAnsi="Symbol" w:hint="default"/>
+        <w:sz w:val="20"/>
+      </w:rPr>
+    </w:lvl>
+    <w:lvl w:ilvl="1" w:tentative="1">
+      <w:start w:val="1"/>
+      <w:numFmt w:val="bullet"/>
+      <w:lvlText w:val="o"/>
+      <w:lvlJc w:val="left"/>
+      <w:pPr>
+        <w:tabs>
+          <w:tab w:val="num" w:pos="1440"/>
+        </w:tabs>
+        <w:ind w:left="1440" w:hanging="360"/>
+      </w:pPr>
+      <w:rPr>
+        <w:rFonts w:ascii="Courier New" w:hAnsi="Courier New" w:hint="default"/>
+        <w:sz w:val="20"/>
+      </w:rPr>
+    </w:lvl>
+    <w:lvl w:ilvl="2" w:tentative="1">
+      <w:start w:val="1"/>
+      <w:numFmt w:val="bullet"/>
+      <w:lvlText w:val=""/>
+      <w:lvlJc w:val="left"/>
+      <w:pPr>
+        <w:tabs>
+          <w:tab w:val="num" w:pos="2160"/>
+        </w:tabs>
+        <w:ind w:left="2160" w:hanging="360"/>
+      </w:pPr>
+      <w:rPr>
+        <w:rFonts w:ascii="Wingdings" w:hAnsi="Wingdings" w:hint="default"/>
+        <w:sz w:val="20"/>
+      </w:rPr>
+    </w:lvl>
+    <w:lvl w:ilvl="3" w:tentative="1">
+      <w:start w:val="1"/>
+      <w:numFmt w:val="bullet"/>
+      <w:lvlText w:val=""/>
+      <w:lvlJc w:val="left"/>
+      <w:pPr>
+        <w:tabs>
+          <w:tab w:val="num" w:pos="2880"/>
+        </w:tabs>
+        <w:ind w:left="2880" w:hanging="360"/>
+      </w:pPr>
+      <w:rPr>
+        <w:rFonts w:ascii="Wingdings" w:hAnsi="Wingdings" w:hint="default"/>
+        <w:sz w:val="20"/>
+      </w:rPr>
+    </w:lvl>
+    <w:lvl w:ilvl="4" w:tentative="1">
+      <w:start w:val="1"/>
+      <w:numFmt w:val="bullet"/>
+      <w:lvlText w:val=""/>
+      <w:lvlJc w:val="left"/>
+      <w:pPr>
+        <w:tabs>
+          <w:tab w:val="num" w:pos="3600"/>
+        </w:tabs>
+        <w:ind w:left="3600" w:hanging="360"/>
+      </w:pPr>
+      <w:rPr>
+        <w:rFonts w:ascii="Wingdings" w:hAnsi="Wingdings" w:hint="default"/>
+        <w:sz w:val="20"/>
+      </w:rPr>
+    </w:lvl>
+    <w:lvl w:ilvl="5" w:tentative="1">
+      <w:start w:val="1"/>
+      <w:numFmt w:val="bullet"/>
+      <w:lvlText w:val=""/>
+      <w:lvlJc w:val="left"/>
+      <w:pPr>
+        <w:tabs>
+          <w:tab w:val="num" w:pos="4320"/>
+        </w:tabs>
+        <w:ind w:left="4320" w:hanging="360"/>
+      </w:pPr>
+      <w:rPr>
+        <w:rFonts w:ascii="Wingdings" w:hAnsi="Wingdings" w:hint="default"/>
+        <w:sz w:val="20"/>
+      </w:rPr>
+    </w:lvl>
+    <w:lvl w:ilvl="6" w:tentative="1">
+      <w:start w:val="1"/>
+      <w:numFmt w:val="bullet"/>
+      <w:lvlText w:val=""/>
+      <w:lvlJc w:val="left"/>
+      <w:pPr>
+        <w:tabs>
+          <w:tab w:val="num" w:pos="5040"/>
+        </w:tabs>
+        <w:ind w:left="5040" w:hanging="360"/>
+      </w:pPr>
+      <w:rPr>
+        <w:rFonts w:ascii="Wingdings" w:hAnsi="Wingdings" w:hint="default"/>
+        <w:sz w:val="20"/>
+      </w:rPr>
+    </w:lvl>
+    <w:lvl w:ilvl="7" w:tentative="1">
+      <w:start w:val="1"/>
+      <w:numFmt w:val="bullet"/>
+      <w:lvlText w:val=""/>
+      <w:lvlJc w:val="left"/>
+      <w:pPr>
+        <w:tabs>
+          <w:tab w:val="num" w:pos="5760"/>
+        </w:tabs>
+        <w:ind w:left="5760" w:hanging="360"/>
+      </w:pPr>
+      <w:rPr>
+        <w:rFonts w:ascii="Wingdings" w:hAnsi="Wingdings" w:hint="default"/>
+        <w:sz w:val="20"/>
+      </w:rPr>
+    </w:lvl>
+    <w:lvl w:ilvl="8" w:tentative="1">
+      <w:start w:val="1"/>
+      <w:numFmt w:val="bullet"/>
+      <w:lvlText w:val=""/>
+      <w:lvlJc w:val="left"/>
+      <w:pPr>
+        <w:tabs>
+          <w:tab w:val="num" w:pos="6480"/>
+        </w:tabs>
+        <w:ind w:left="6480" w:hanging="360"/>
+      </w:pPr>
+      <w:rPr>
+        <w:rFonts w:ascii="Wingdings" w:hAnsi="Wingdings" w:hint="default"/>
+        <w:sz w:val="20"/>
+      </w:rPr>
+    </w:lvl>
+  </w:abstractNum>
+  <w:abstractNum w:abstractNumId="16" w15:restartNumberingAfterBreak="0">
+    <w:nsid w:val="78BB6BF4"/>
+    <w:multiLevelType w:val="multilevel"/>
+    <w:tmpl w:val="83EA3B46"/>
+    <w:lvl w:ilvl="0">
+      <w:start w:val="1"/>
+      <w:numFmt w:val="bullet"/>
+      <w:lvlText w:val=""/>
+      <w:lvlJc w:val="left"/>
+      <w:pPr>
+        <w:tabs>
+          <w:tab w:val="num" w:pos="720"/>
+        </w:tabs>
+        <w:ind w:left="720" w:hanging="360"/>
+      </w:pPr>
+      <w:rPr>
+        <w:rFonts w:ascii="Symbol" w:hAnsi="Symbol" w:hint="default"/>
+        <w:sz w:val="20"/>
+      </w:rPr>
+    </w:lvl>
+    <w:lvl w:ilvl="1" w:tentative="1">
+      <w:start w:val="1"/>
+      <w:numFmt w:val="bullet"/>
+      <w:lvlText w:val="o"/>
+      <w:lvlJc w:val="left"/>
+      <w:pPr>
+        <w:tabs>
+          <w:tab w:val="num" w:pos="1440"/>
+        </w:tabs>
+        <w:ind w:left="1440" w:hanging="360"/>
+      </w:pPr>
+      <w:rPr>
+        <w:rFonts w:ascii="Courier New" w:hAnsi="Courier New" w:hint="default"/>
+        <w:sz w:val="20"/>
+      </w:rPr>
+    </w:lvl>
+    <w:lvl w:ilvl="2" w:tentative="1">
+      <w:start w:val="1"/>
+      <w:numFmt w:val="bullet"/>
+      <w:lvlText w:val=""/>
+      <w:lvlJc w:val="left"/>
+      <w:pPr>
+        <w:tabs>
+          <w:tab w:val="num" w:pos="2160"/>
+        </w:tabs>
+        <w:ind w:left="2160" w:hanging="360"/>
+      </w:pPr>
+      <w:rPr>
+        <w:rFonts w:ascii="Wingdings" w:hAnsi="Wingdings" w:hint="default"/>
+        <w:sz w:val="20"/>
+      </w:rPr>
+    </w:lvl>
+    <w:lvl w:ilvl="3" w:tentative="1">
+      <w:start w:val="1"/>
+      <w:numFmt w:val="bullet"/>
+      <w:lvlText w:val=""/>
+      <w:lvlJc w:val="left"/>
+      <w:pPr>
+        <w:tabs>
+          <w:tab w:val="num" w:pos="2880"/>
+        </w:tabs>
+        <w:ind w:left="2880" w:hanging="360"/>
+      </w:pPr>
+      <w:rPr>
+        <w:rFonts w:ascii="Wingdings" w:hAnsi="Wingdings" w:hint="default"/>
+        <w:sz w:val="20"/>
+      </w:rPr>
+    </w:lvl>
+    <w:lvl w:ilvl="4" w:tentative="1">
+      <w:start w:val="1"/>
+      <w:numFmt w:val="bullet"/>
+      <w:lvlText w:val=""/>
+      <w:lvlJc w:val="left"/>
+      <w:pPr>
+        <w:tabs>
+          <w:tab w:val="num" w:pos="3600"/>
+        </w:tabs>
+        <w:ind w:left="3600" w:hanging="360"/>
+      </w:pPr>
+      <w:rPr>
+        <w:rFonts w:ascii="Wingdings" w:hAnsi="Wingdings" w:hint="default"/>
+        <w:sz w:val="20"/>
+      </w:rPr>
+    </w:lvl>
+    <w:lvl w:ilvl="5" w:tentative="1">
+      <w:start w:val="1"/>
+      <w:numFmt w:val="bullet"/>
+      <w:lvlText w:val=""/>
+      <w:lvlJc w:val="left"/>
+      <w:pPr>
+        <w:tabs>
+          <w:tab w:val="num" w:pos="4320"/>
+        </w:tabs>
+        <w:ind w:left="4320" w:hanging="360"/>
+      </w:pPr>
+      <w:rPr>
+        <w:rFonts w:ascii="Wingdings" w:hAnsi="Wingdings" w:hint="default"/>
+        <w:sz w:val="20"/>
+      </w:rPr>
+    </w:lvl>
+    <w:lvl w:ilvl="6" w:tentative="1">
+      <w:start w:val="1"/>
+      <w:numFmt w:val="bullet"/>
+      <w:lvlText w:val=""/>
+      <w:lvlJc w:val="left"/>
+      <w:pPr>
+        <w:tabs>
+          <w:tab w:val="num" w:pos="5040"/>
+        </w:tabs>
+        <w:ind w:left="5040" w:hanging="360"/>
+      </w:pPr>
+      <w:rPr>
+        <w:rFonts w:ascii="Wingdings" w:hAnsi="Wingdings" w:hint="default"/>
+        <w:sz w:val="20"/>
+      </w:rPr>
+    </w:lvl>
+    <w:lvl w:ilvl="7" w:tentative="1">
+      <w:start w:val="1"/>
+      <w:numFmt w:val="bullet"/>
+      <w:lvlText w:val=""/>
+      <w:lvlJc w:val="left"/>
+      <w:pPr>
+        <w:tabs>
+          <w:tab w:val="num" w:pos="5760"/>
+        </w:tabs>
+        <w:ind w:left="5760" w:hanging="360"/>
+      </w:pPr>
+      <w:rPr>
+        <w:rFonts w:ascii="Wingdings" w:hAnsi="Wingdings" w:hint="default"/>
+        <w:sz w:val="20"/>
+      </w:rPr>
+    </w:lvl>
+    <w:lvl w:ilvl="8" w:tentative="1">
+      <w:start w:val="1"/>
+      <w:numFmt w:val="bullet"/>
+      <w:lvlText w:val=""/>
+      <w:lvlJc w:val="left"/>
+      <w:pPr>
+        <w:tabs>
+          <w:tab w:val="num" w:pos="6480"/>
+        </w:tabs>
+        <w:ind w:left="6480" w:hanging="360"/>
+      </w:pPr>
+      <w:rPr>
+        <w:rFonts w:ascii="Wingdings" w:hAnsi="Wingdings" w:hint="default"/>
+        <w:sz w:val="20"/>
+      </w:rPr>
+    </w:lvl>
+  </w:abstractNum>
+  <w:abstractNum w:abstractNumId="17" w15:restartNumberingAfterBreak="0">
+    <w:nsid w:val="7BD149C3"/>
+    <w:multiLevelType w:val="multilevel"/>
+    <w:tmpl w:val="F1D28A84"/>
+    <w:lvl w:ilvl="0">
+      <w:start w:val="1"/>
+      <w:numFmt w:val="decimal"/>
+      <w:lvlText w:val="%1."/>
+      <w:lvlJc w:val="left"/>
+      <w:pPr>
+        <w:tabs>
+          <w:tab w:val="num" w:pos="720"/>
+        </w:tabs>
+        <w:ind w:left="720" w:hanging="360"/>
+      </w:pPr>
+    </w:lvl>
+    <w:lvl w:ilvl="1" w:tentative="1">
+      <w:start w:val="1"/>
+      <w:numFmt w:val="decimal"/>
+      <w:lvlText w:val="%2."/>
+      <w:lvlJc w:val="left"/>
+      <w:pPr>
+        <w:tabs>
+          <w:tab w:val="num" w:pos="1440"/>
+        </w:tabs>
+        <w:ind w:left="1440" w:hanging="360"/>
+      </w:pPr>
+    </w:lvl>
+    <w:lvl w:ilvl="2" w:tentative="1">
+      <w:start w:val="1"/>
+      <w:numFmt w:val="decimal"/>
+      <w:lvlText w:val="%3."/>
+      <w:lvlJc w:val="left"/>
+      <w:pPr>
+        <w:tabs>
+          <w:tab w:val="num" w:pos="2160"/>
+        </w:tabs>
+        <w:ind w:left="2160" w:hanging="360"/>
+      </w:pPr>
+    </w:lvl>
+    <w:lvl w:ilvl="3" w:tentative="1">
+      <w:start w:val="1"/>
+      <w:numFmt w:val="decimal"/>
+      <w:lvlText w:val="%4."/>
+      <w:lvlJc w:val="left"/>
+      <w:pPr>
+        <w:tabs>
+          <w:tab w:val="num" w:pos="2880"/>
+        </w:tabs>
+        <w:ind w:left="2880" w:hanging="360"/>
+      </w:pPr>
+    </w:lvl>
+    <w:lvl w:ilvl="4" w:tentative="1">
+      <w:start w:val="1"/>
+      <w:numFmt w:val="decimal"/>
+      <w:lvlText w:val="%5."/>
+      <w:lvlJc w:val="left"/>
+      <w:pPr>
+        <w:tabs>
+          <w:tab w:val="num" w:pos="3600"/>
+        </w:tabs>
+        <w:ind w:left="3600" w:hanging="360"/>
+      </w:pPr>
+    </w:lvl>
+    <w:lvl w:ilvl="5" w:tentative="1">
+      <w:start w:val="1"/>
+      <w:numFmt w:val="decimal"/>
+      <w:lvlText w:val="%6."/>
+      <w:lvlJc w:val="left"/>
+      <w:pPr>
+        <w:tabs>
+          <w:tab w:val="num" w:pos="4320"/>
+        </w:tabs>
+        <w:ind w:left="4320" w:hanging="360"/>
+      </w:pPr>
+    </w:lvl>
+    <w:lvl w:ilvl="6" w:tentative="1">
+      <w:start w:val="1"/>
+      <w:numFmt w:val="decimal"/>
+      <w:lvlText w:val="%7."/>
+      <w:lvlJc w:val="left"/>
+      <w:pPr>
+        <w:tabs>
+          <w:tab w:val="num" w:pos="5040"/>
+        </w:tabs>
+        <w:ind w:left="5040" w:hanging="360"/>
+      </w:pPr>
+    </w:lvl>
+    <w:lvl w:ilvl="7" w:tentative="1">
+      <w:start w:val="1"/>
+      <w:numFmt w:val="decimal"/>
+      <w:lvlText w:val="%8."/>
+      <w:lvlJc w:val="left"/>
+      <w:pPr>
+        <w:tabs>
+          <w:tab w:val="num" w:pos="5760"/>
+        </w:tabs>
+        <w:ind w:left="5760" w:hanging="360"/>
+      </w:pPr>
+    </w:lvl>
+    <w:lvl w:ilvl="8" w:tentative="1">
+      <w:start w:val="1"/>
+      <w:numFmt w:val="decimal"/>
+      <w:lvlText w:val="%9."/>
+      <w:lvlJc w:val="left"/>
+      <w:pPr>
+        <w:tabs>
+          <w:tab w:val="num" w:pos="6480"/>
+        </w:tabs>
+        <w:ind w:left="6480" w:hanging="360"/>
+      </w:pPr>
+    </w:lvl>
+  </w:abstractNum>
   <w:num w:numId="1" w16cid:durableId="1666974504">
-    <w:abstractNumId w:val="1"/>
+    <w:abstractNumId w:val="4"/>
   </w:num>
   <w:num w:numId="2" w16cid:durableId="926111482">
-    <w:abstractNumId w:val="2"/>
+    <w:abstractNumId w:val="6"/>
   </w:num>
   <w:num w:numId="3" w16cid:durableId="1694451563">
     <w:abstractNumId w:val="0"/>
   </w:num>
   <w:num w:numId="4" w16cid:durableId="289434971">
-    <w:abstractNumId w:val="4"/>
+    <w:abstractNumId w:val="14"/>
   </w:num>
   <w:num w:numId="5" w16cid:durableId="1117018557">
+    <w:abstractNumId w:val="9"/>
+  </w:num>
+  <w:num w:numId="6" w16cid:durableId="720861850">
+    <w:abstractNumId w:val="8"/>
+  </w:num>
+  <w:num w:numId="7" w16cid:durableId="584997198">
+    <w:abstractNumId w:val="7"/>
+  </w:num>
+  <w:num w:numId="8" w16cid:durableId="70935612">
+    <w:abstractNumId w:val="12"/>
+  </w:num>
+  <w:num w:numId="9" w16cid:durableId="1062601679">
+    <w:abstractNumId w:val="1"/>
+  </w:num>
+  <w:num w:numId="10" w16cid:durableId="1561165395">
+    <w:abstractNumId w:val="11"/>
+  </w:num>
+  <w:num w:numId="11" w16cid:durableId="408625886">
+    <w:abstractNumId w:val="2"/>
+  </w:num>
+  <w:num w:numId="12" w16cid:durableId="1085612428">
+    <w:abstractNumId w:val="13"/>
+  </w:num>
+  <w:num w:numId="13" w16cid:durableId="407964471">
+    <w:abstractNumId w:val="5"/>
+  </w:num>
+  <w:num w:numId="14" w16cid:durableId="654533197">
+    <w:abstractNumId w:val="17"/>
+  </w:num>
+  <w:num w:numId="15" w16cid:durableId="1020468986">
+    <w:abstractNumId w:val="16"/>
+  </w:num>
+  <w:num w:numId="16" w16cid:durableId="42873466">
     <w:abstractNumId w:val="3"/>
+  </w:num>
+  <w:num w:numId="17" w16cid:durableId="1177185850">
+    <w:abstractNumId w:val="10"/>
+  </w:num>
+  <w:num w:numId="18" w16cid:durableId="863440903">
+    <w:abstractNumId w:val="15"/>
   </w:num>
 </w:numbering>
 </file>

</xml_diff>